<commit_message>
Added doc notes on 'Instanced Rendering'
</commit_message>
<xml_diff>
--- a/docs/Vulkan Notes.docx
+++ b/docs/Vulkan Notes.docx
@@ -52,15 +52,7 @@
         </w:numPr>
       </w:pPr>
       <w:r>
-        <w:t>Create a ‘</w:t>
-      </w:r>
-      <w:proofErr w:type="spellStart"/>
-      <w:r>
-        <w:t>VkInstance</w:t>
-      </w:r>
-      <w:proofErr w:type="spellEnd"/>
-      <w:r>
-        <w:t>’</w:t>
+        <w:t>Create a ‘VkInstance’</w:t>
       </w:r>
     </w:p>
     <w:p>
@@ -93,23 +85,7 @@
         </w:numPr>
       </w:pPr>
       <w:r>
-        <w:t>Create a ‘</w:t>
-      </w:r>
-      <w:proofErr w:type="spellStart"/>
-      <w:r>
-        <w:t>VkDevice</w:t>
-      </w:r>
-      <w:proofErr w:type="spellEnd"/>
-      <w:r>
-        <w:t>’, described by ‘</w:t>
-      </w:r>
-      <w:proofErr w:type="spellStart"/>
-      <w:r>
-        <w:t>VkPhysicalDeviceFeatures</w:t>
-      </w:r>
-      <w:proofErr w:type="spellEnd"/>
-      <w:r>
-        <w:t>’</w:t>
+        <w:t>Create a ‘VkDevice’, described by ‘VkPhysicalDeviceFeatures’</w:t>
       </w:r>
     </w:p>
     <w:p>
@@ -121,15 +97,7 @@
         </w:numPr>
       </w:pPr>
       <w:r>
-        <w:t>Most Vulkan operations are performed by submitting them to a ‘</w:t>
-      </w:r>
-      <w:proofErr w:type="spellStart"/>
-      <w:r>
-        <w:t>VkQueue</w:t>
-      </w:r>
-      <w:proofErr w:type="spellEnd"/>
-      <w:r>
-        <w:t>’</w:t>
+        <w:t>Most Vulkan operations are performed by submitting them to a ‘VkQueue’</w:t>
       </w:r>
     </w:p>
     <w:p>
@@ -177,23 +145,7 @@
         <w:t>Each window needs a</w:t>
       </w:r>
       <w:r>
-        <w:t xml:space="preserve"> surface ‘</w:t>
-      </w:r>
-      <w:proofErr w:type="spellStart"/>
-      <w:r>
-        <w:t>VkSurfaceKHR</w:t>
-      </w:r>
-      <w:proofErr w:type="spellEnd"/>
-      <w:r>
-        <w:t>’ and a swap chain ‘</w:t>
-      </w:r>
-      <w:proofErr w:type="spellStart"/>
-      <w:r>
-        <w:t>VkSwapchainKHR</w:t>
-      </w:r>
-      <w:proofErr w:type="spellEnd"/>
-      <w:r>
-        <w:t>’</w:t>
+        <w:t xml:space="preserve"> surface ‘VkSurfaceKHR’ and a swap chain ‘VkSwapchainKHR’</w:t>
       </w:r>
     </w:p>
     <w:p>
@@ -246,23 +198,7 @@
         </w:numPr>
       </w:pPr>
       <w:r>
-        <w:t>To draw to a swap chain image, we need to wrap it in ‘</w:t>
-      </w:r>
-      <w:proofErr w:type="spellStart"/>
-      <w:r>
-        <w:t>VkImageView</w:t>
-      </w:r>
-      <w:proofErr w:type="spellEnd"/>
-      <w:r>
-        <w:t>’ and ‘</w:t>
-      </w:r>
-      <w:proofErr w:type="spellStart"/>
-      <w:r>
-        <w:t>VkFrameBuffer</w:t>
-      </w:r>
-      <w:proofErr w:type="spellEnd"/>
-      <w:r>
-        <w:t>’</w:t>
+        <w:t>To draw to a swap chain image, we need to wrap it in ‘VkImageView’ and ‘VkFrameBuffer’</w:t>
       </w:r>
     </w:p>
     <w:p>
@@ -391,23 +327,7 @@
         </w:numPr>
       </w:pPr>
       <w:r>
-        <w:t>Create a ‘</w:t>
-      </w:r>
-      <w:proofErr w:type="spellStart"/>
-      <w:r>
-        <w:t>VkPipeline</w:t>
-      </w:r>
-      <w:proofErr w:type="spellEnd"/>
-      <w:r>
-        <w:t>’ object, which describes the state of the GPU, such as viewport size, how to treat the depth buffer, and programmable states using ‘</w:t>
-      </w:r>
-      <w:proofErr w:type="spellStart"/>
-      <w:r>
-        <w:t>VkShaderModules</w:t>
-      </w:r>
-      <w:proofErr w:type="spellEnd"/>
-      <w:r>
-        <w:t>’</w:t>
+        <w:t>Create a ‘VkPipeline’ object, which describes the state of the GPU, such as viewport size, how to treat the depth buffer, and programmable states using ‘VkShaderModules’</w:t>
       </w:r>
     </w:p>
     <w:p>
@@ -452,23 +372,7 @@
         </w:numPr>
       </w:pPr>
       <w:r>
-        <w:t xml:space="preserve">Each operation submitted to the </w:t>
-      </w:r>
-      <w:proofErr w:type="spellStart"/>
-      <w:r>
-        <w:t>VkQueue</w:t>
-      </w:r>
-      <w:proofErr w:type="spellEnd"/>
-      <w:r>
-        <w:t xml:space="preserve"> must first be recorded into a ‘</w:t>
-      </w:r>
-      <w:proofErr w:type="spellStart"/>
-      <w:r>
-        <w:t>VkCommandBuffer</w:t>
-      </w:r>
-      <w:proofErr w:type="spellEnd"/>
-      <w:r>
-        <w:t>’ and then submitted</w:t>
+        <w:t>Each operation submitted to the VkQueue must first be recorded into a ‘VkCommandBuffer’ and then submitted</w:t>
       </w:r>
     </w:p>
     <w:p>
@@ -480,15 +384,7 @@
         </w:numPr>
       </w:pPr>
       <w:r>
-        <w:t>Each command buffer is allocated from a ‘</w:t>
-      </w:r>
-      <w:proofErr w:type="spellStart"/>
-      <w:r>
-        <w:t>VkCommandPool</w:t>
-      </w:r>
-      <w:proofErr w:type="spellEnd"/>
-      <w:r>
-        <w:t>’ which is associated with a specific queue family</w:t>
+        <w:t>Each command buffer is allocated from a ‘VkCommandPool’ which is associated with a specific queue family</w:t>
       </w:r>
     </w:p>
     <w:p>
@@ -536,15 +432,7 @@
         </w:numPr>
       </w:pPr>
       <w:r>
-        <w:t>Acquire image from the swap chain via ‘</w:t>
-      </w:r>
-      <w:proofErr w:type="spellStart"/>
-      <w:r>
-        <w:t>vkAcquireNextImageKHR</w:t>
-      </w:r>
-      <w:proofErr w:type="spellEnd"/>
-      <w:r>
-        <w:t>’</w:t>
+        <w:t>Acquire image from the swap chain via ‘vkAcquireNextImageKHR’</w:t>
       </w:r>
     </w:p>
     <w:p>
@@ -556,15 +444,7 @@
         </w:numPr>
       </w:pPr>
       <w:r>
-        <w:t>Select appropriate command buffer for that image and execute it with ‘</w:t>
-      </w:r>
-      <w:proofErr w:type="spellStart"/>
-      <w:r>
-        <w:t>vkQueueSubmit</w:t>
-      </w:r>
-      <w:proofErr w:type="spellEnd"/>
-      <w:r>
-        <w:t>’</w:t>
+        <w:t>Select appropriate command buffer for that image and execute it with ‘vkQueueSubmit’</w:t>
       </w:r>
     </w:p>
     <w:p>
@@ -576,15 +456,7 @@
         </w:numPr>
       </w:pPr>
       <w:r>
-        <w:t>Return image to swap chain to then present to screen with ‘</w:t>
-      </w:r>
-      <w:proofErr w:type="spellStart"/>
-      <w:r>
-        <w:t>vkQueuePresentKHR</w:t>
-      </w:r>
-      <w:proofErr w:type="spellEnd"/>
-      <w:r>
-        <w:t>’</w:t>
+        <w:t>Return image to swap chain to then present to screen with ‘vkQueuePresentKHR’</w:t>
       </w:r>
     </w:p>
     <w:p>
@@ -620,15 +492,7 @@
         </w:numPr>
       </w:pPr>
       <w:r>
-        <w:t>Semaphore 2 is set so ‘</w:t>
-      </w:r>
-      <w:proofErr w:type="spellStart"/>
-      <w:r>
-        <w:t>vkQueuePresentKHR</w:t>
-      </w:r>
-      <w:proofErr w:type="spellEnd"/>
-      <w:r>
-        <w:t>’ must wait for rendering to finish, so we again do not draw to an image already in use</w:t>
+        <w:t>Semaphore 2 is set so ‘vkQueuePresentKHR’ must wait for rendering to finish, so we again do not draw to an image already in use</w:t>
       </w:r>
     </w:p>
     <w:p/>
@@ -642,26 +506,10 @@
     </w:p>
     <w:p>
       <w:r>
-        <w:t xml:space="preserve">All Vulkan functions, </w:t>
-      </w:r>
-      <w:proofErr w:type="spellStart"/>
-      <w:r>
-        <w:t>enums</w:t>
-      </w:r>
-      <w:proofErr w:type="spellEnd"/>
-      <w:r>
-        <w:t xml:space="preserve"> and structs are defined in </w:t>
-      </w:r>
-      <w:r>
-        <w:t>the ‘</w:t>
-      </w:r>
-      <w:proofErr w:type="spellStart"/>
-      <w:r>
-        <w:t>vulkan.h</w:t>
-      </w:r>
-      <w:proofErr w:type="spellEnd"/>
-      <w:r>
-        <w:t>’ header file.</w:t>
+        <w:t xml:space="preserve">All Vulkan functions, enums and structs are defined in </w:t>
+      </w:r>
+      <w:r>
+        <w:t>the ‘vulkan.h’ header file.</w:t>
       </w:r>
     </w:p>
     <w:p>
@@ -677,11 +525,15 @@
           <w:numId w:val="2"/>
         </w:numPr>
       </w:pPr>
-      <w:proofErr w:type="spellStart"/>
-      <w:r>
-        <w:t>vk</w:t>
-      </w:r>
-      <w:proofErr w:type="spellEnd"/>
+      <w:r>
+        <w:t xml:space="preserve">vk </w:t>
+      </w:r>
+      <w:r>
+        <w:tab/>
+      </w:r>
+      <w:r>
+        <w:sym w:font="Wingdings" w:char="F0E0"/>
+      </w:r>
       <w:r>
         <w:t xml:space="preserve"> </w:t>
       </w:r>
@@ -689,6 +541,24 @@
         <w:tab/>
       </w:r>
       <w:r>
+        <w:t>function</w:t>
+      </w:r>
+    </w:p>
+    <w:p>
+      <w:pPr>
+        <w:pStyle w:val="ListParagraph"/>
+        <w:numPr>
+          <w:ilvl w:val="0"/>
+          <w:numId w:val="2"/>
+        </w:numPr>
+      </w:pPr>
+      <w:r>
+        <w:t xml:space="preserve">Vk </w:t>
+      </w:r>
+      <w:r>
+        <w:tab/>
+      </w:r>
+      <w:r>
         <w:sym w:font="Wingdings" w:char="F0E0"/>
       </w:r>
       <w:r>
@@ -698,7 +568,7 @@
         <w:tab/>
       </w:r>
       <w:r>
-        <w:t>function</w:t>
+        <w:t>type (enum, struct)</w:t>
       </w:r>
     </w:p>
     <w:p>
@@ -709,11 +579,15 @@
           <w:numId w:val="2"/>
         </w:numPr>
       </w:pPr>
-      <w:proofErr w:type="spellStart"/>
-      <w:r>
-        <w:t>Vk</w:t>
-      </w:r>
-      <w:proofErr w:type="spellEnd"/>
+      <w:r>
+        <w:t xml:space="preserve">VK_ </w:t>
+      </w:r>
+      <w:r>
+        <w:tab/>
+      </w:r>
+      <w:r>
+        <w:sym w:font="Wingdings" w:char="F0E0"/>
+      </w:r>
       <w:r>
         <w:t xml:space="preserve"> </w:t>
       </w:r>
@@ -721,56 +595,7 @@
         <w:tab/>
       </w:r>
       <w:r>
-        <w:sym w:font="Wingdings" w:char="F0E0"/>
-      </w:r>
-      <w:r>
-        <w:t xml:space="preserve"> </w:t>
-      </w:r>
-      <w:r>
-        <w:tab/>
-      </w:r>
-      <w:r>
-        <w:t>type (</w:t>
-      </w:r>
-      <w:proofErr w:type="spellStart"/>
-      <w:r>
-        <w:t>enum</w:t>
-      </w:r>
-      <w:proofErr w:type="spellEnd"/>
-      <w:r>
-        <w:t>, struct)</w:t>
-      </w:r>
-    </w:p>
-    <w:p>
-      <w:pPr>
-        <w:pStyle w:val="ListParagraph"/>
-        <w:numPr>
-          <w:ilvl w:val="0"/>
-          <w:numId w:val="2"/>
-        </w:numPr>
-      </w:pPr>
-      <w:r>
-        <w:t xml:space="preserve">VK_ </w:t>
-      </w:r>
-      <w:r>
-        <w:tab/>
-      </w:r>
-      <w:r>
-        <w:sym w:font="Wingdings" w:char="F0E0"/>
-      </w:r>
-      <w:r>
-        <w:t xml:space="preserve"> </w:t>
-      </w:r>
-      <w:r>
-        <w:tab/>
-      </w:r>
-      <w:proofErr w:type="spellStart"/>
-      <w:r>
-        <w:t>enum</w:t>
-      </w:r>
-      <w:proofErr w:type="spellEnd"/>
-      <w:r>
-        <w:t xml:space="preserve"> value</w:t>
+        <w:t>enum value</w:t>
       </w:r>
     </w:p>
     <w:p>
@@ -898,15 +723,7 @@
     </w:p>
     <w:p>
       <w:r>
-        <w:t>Functions that create or destroy objects will have ‘</w:t>
-      </w:r>
-      <w:proofErr w:type="spellStart"/>
-      <w:r>
-        <w:t>VkAllocationCallbacks</w:t>
-      </w:r>
-      <w:proofErr w:type="spellEnd"/>
-      <w:r>
-        <w:t>’</w:t>
+        <w:t>Functions that create or destroy objects will have ‘VkAllocationCallbacks’</w:t>
       </w:r>
       <w:r>
         <w:t xml:space="preserve"> parameters, which allow for custom allocators for driver memory. Very complex, should avoid </w:t>
@@ -1028,21 +845,7 @@
           <w:rPr>
             <w:rStyle w:val="Hyperlink"/>
           </w:rPr>
-          <w:t xml:space="preserve">the </w:t>
-        </w:r>
-        <w:proofErr w:type="spellStart"/>
-        <w:r>
-          <w:rPr>
-            <w:rStyle w:val="Hyperlink"/>
-          </w:rPr>
-          <w:t>LunarG</w:t>
-        </w:r>
-        <w:proofErr w:type="spellEnd"/>
-        <w:r>
-          <w:rPr>
-            <w:rStyle w:val="Hyperlink"/>
-          </w:rPr>
-          <w:t xml:space="preserve"> website</w:t>
+          <w:t>the LunarG website</w:t>
         </w:r>
       </w:hyperlink>
       <w:r>
@@ -1066,15 +869,7 @@
     </w:p>
     <w:p>
       <w:r>
-        <w:t>To check if you already have the SDK installed, you can run ‘</w:t>
-      </w:r>
-      <w:proofErr w:type="spellStart"/>
-      <w:r>
-        <w:t>vulkaninfo</w:t>
-      </w:r>
-      <w:proofErr w:type="spellEnd"/>
-      <w:r>
-        <w:t xml:space="preserve">’ </w:t>
+        <w:t xml:space="preserve">To check if you already have the SDK installed, you can run ‘vulkaninfo’ </w:t>
       </w:r>
       <w:r>
         <w:t>within a command prompt or terminal. This will tell you which version ‘VULKAN_SDK’ is set to.</w:t>
@@ -2064,39 +1859,7 @@
     </w:p>
     <w:p>
       <w:r>
-        <w:t>All Vulkan objects are created via ‘</w:t>
-      </w:r>
-      <w:proofErr w:type="spellStart"/>
-      <w:r>
-        <w:t>vkCreateXXX</w:t>
-      </w:r>
-      <w:proofErr w:type="spellEnd"/>
-      <w:r>
-        <w:t>’ or allocated via another object using ‘</w:t>
-      </w:r>
-      <w:proofErr w:type="spellStart"/>
-      <w:r>
-        <w:t>vkAllocateXXX</w:t>
-      </w:r>
-      <w:proofErr w:type="spellEnd"/>
-      <w:r>
-        <w:t>’. Objects can then be destroyed using ‘</w:t>
-      </w:r>
-      <w:proofErr w:type="spellStart"/>
-      <w:r>
-        <w:t>vkDestroyXXX</w:t>
-      </w:r>
-      <w:proofErr w:type="spellEnd"/>
-      <w:r>
-        <w:t>’ or ‘</w:t>
-      </w:r>
-      <w:proofErr w:type="spellStart"/>
-      <w:r>
-        <w:t>vkFreeXXX</w:t>
-      </w:r>
-      <w:proofErr w:type="spellEnd"/>
-      <w:r>
-        <w:t xml:space="preserve">’. The params for these functions vary from object to object, but share one common </w:t>
+        <w:t xml:space="preserve">All Vulkan objects are created via ‘vkCreateXXX’ or allocated via another object using ‘vkAllocateXXX’. Objects can then be destroyed using ‘vkDestroyXXX’ or ‘vkFreeXXX’. The params for these functions vary from object to object, but share one common </w:t>
       </w:r>
       <w:r>
         <w:t xml:space="preserve">optional </w:t>
@@ -2108,15 +1871,7 @@
         <w:t>,</w:t>
       </w:r>
       <w:r>
-        <w:t xml:space="preserve"> ‘</w:t>
-      </w:r>
-      <w:proofErr w:type="spellStart"/>
-      <w:r>
-        <w:t>pAllocator</w:t>
-      </w:r>
-      <w:proofErr w:type="spellEnd"/>
-      <w:r>
-        <w:t>’</w:t>
+        <w:t xml:space="preserve"> ‘pAllocator’</w:t>
       </w:r>
       <w:r>
         <w:t>, which allows you to specify a callback for a custom allocator.</w:t>
@@ -2329,21 +2084,7 @@
         <w:rPr>
           <w:lang w:eastAsia="en-AU"/>
         </w:rPr>
-        <w:t xml:space="preserve">Vulkan itself does not come with any validation layers, but the </w:t>
-      </w:r>
-      <w:proofErr w:type="spellStart"/>
-      <w:r>
-        <w:rPr>
-          <w:lang w:eastAsia="en-AU"/>
-        </w:rPr>
-        <w:t>LunarG</w:t>
-      </w:r>
-      <w:proofErr w:type="spellEnd"/>
-      <w:r>
-        <w:rPr>
-          <w:lang w:eastAsia="en-AU"/>
-        </w:rPr>
-        <w:t xml:space="preserve"> SDK does.</w:t>
+        <w:t>Vulkan itself does not come with any validation layers, but the LunarG SDK does.</w:t>
       </w:r>
     </w:p>
     <w:p>
@@ -2412,21 +2153,7 @@
         <w:rPr>
           <w:lang w:eastAsia="en-AU"/>
         </w:rPr>
-        <w:t xml:space="preserve">output to the standard C++ </w:t>
-      </w:r>
-      <w:proofErr w:type="spellStart"/>
-      <w:r>
-        <w:rPr>
-          <w:lang w:eastAsia="en-AU"/>
-        </w:rPr>
-        <w:t>cout</w:t>
-      </w:r>
-      <w:proofErr w:type="spellEnd"/>
-      <w:r>
-        <w:rPr>
-          <w:lang w:eastAsia="en-AU"/>
-        </w:rPr>
-        <w:t>, but we can set Vulkan to use a custom message callback instead. The following parameters for said function and their purpose are as follows:</w:t>
+        <w:t>output to the standard C++ cout, but we can set Vulkan to use a custom message callback instead. The following parameters for said function and their purpose are as follows:</w:t>
       </w:r>
     </w:p>
     <w:tbl>
@@ -2456,21 +2183,7 @@
               <w:rPr>
                 <w:lang w:eastAsia="en-AU"/>
               </w:rPr>
-              <w:t>‘</w:t>
-            </w:r>
-            <w:proofErr w:type="spellStart"/>
-            <w:r>
-              <w:rPr>
-                <w:lang w:eastAsia="en-AU"/>
-              </w:rPr>
-              <w:t>messageSeverity</w:t>
-            </w:r>
-            <w:proofErr w:type="spellEnd"/>
-            <w:r>
-              <w:rPr>
-                <w:lang w:eastAsia="en-AU"/>
-              </w:rPr>
-              <w:t>’ can have the values</w:t>
+              <w:t>‘messageSeverity’ can have the values</w:t>
             </w:r>
             <w:r>
               <w:rPr>
@@ -2664,21 +2377,7 @@
               <w:rPr>
                 <w:lang w:eastAsia="en-AU"/>
               </w:rPr>
-              <w:t>‘</w:t>
-            </w:r>
-            <w:proofErr w:type="spellStart"/>
-            <w:r>
-              <w:rPr>
-                <w:lang w:eastAsia="en-AU"/>
-              </w:rPr>
-              <w:t>messageType</w:t>
-            </w:r>
-            <w:proofErr w:type="spellEnd"/>
-            <w:r>
-              <w:rPr>
-                <w:lang w:eastAsia="en-AU"/>
-              </w:rPr>
-              <w:t>’ can have the values VK_DEBUG_UTILS_MESSAGE_TYPE…</w:t>
+              <w:t>‘messageType’ can have the values VK_DEBUG_UTILS_MESSAGE_TYPE…</w:t>
             </w:r>
           </w:p>
         </w:tc>
@@ -2820,21 +2519,7 @@
               <w:rPr>
                 <w:lang w:eastAsia="en-AU"/>
               </w:rPr>
-              <w:t>‘</w:t>
-            </w:r>
-            <w:proofErr w:type="spellStart"/>
-            <w:r>
-              <w:rPr>
-                <w:lang w:eastAsia="en-AU"/>
-              </w:rPr>
-              <w:t>pCallbackData</w:t>
-            </w:r>
-            <w:proofErr w:type="spellEnd"/>
-            <w:r>
-              <w:rPr>
-                <w:lang w:eastAsia="en-AU"/>
-              </w:rPr>
-              <w:t>’ is a struct with the following members</w:t>
+              <w:t>‘pCallbackData’ is a struct with the following members</w:t>
             </w:r>
           </w:p>
         </w:tc>
@@ -2851,14 +2536,12 @@
                 <w:lang w:eastAsia="en-AU"/>
               </w:rPr>
             </w:pPr>
-            <w:proofErr w:type="spellStart"/>
             <w:r>
               <w:rPr>
                 <w:lang w:eastAsia="en-AU"/>
               </w:rPr>
               <w:t>pMessage</w:t>
             </w:r>
-            <w:proofErr w:type="spellEnd"/>
           </w:p>
         </w:tc>
         <w:tc>
@@ -2899,14 +2582,12 @@
                 <w:lang w:eastAsia="en-AU"/>
               </w:rPr>
             </w:pPr>
-            <w:proofErr w:type="spellStart"/>
             <w:r>
               <w:rPr>
                 <w:lang w:eastAsia="en-AU"/>
               </w:rPr>
               <w:t>pObjects</w:t>
             </w:r>
-            <w:proofErr w:type="spellEnd"/>
           </w:p>
         </w:tc>
         <w:tc>
@@ -2941,14 +2622,12 @@
                 <w:lang w:eastAsia="en-AU"/>
               </w:rPr>
             </w:pPr>
-            <w:proofErr w:type="spellStart"/>
             <w:r>
               <w:rPr>
                 <w:lang w:eastAsia="en-AU"/>
               </w:rPr>
               <w:t>objectCount</w:t>
             </w:r>
-            <w:proofErr w:type="spellEnd"/>
           </w:p>
         </w:tc>
         <w:tc>
@@ -2966,21 +2645,7 @@
               <w:rPr>
                 <w:lang w:eastAsia="en-AU"/>
               </w:rPr>
-              <w:t>Number of objects in ‘</w:t>
-            </w:r>
-            <w:proofErr w:type="spellStart"/>
-            <w:r>
-              <w:rPr>
-                <w:lang w:eastAsia="en-AU"/>
-              </w:rPr>
-              <w:t>pObjects</w:t>
-            </w:r>
-            <w:proofErr w:type="spellEnd"/>
-            <w:r>
-              <w:rPr>
-                <w:lang w:eastAsia="en-AU"/>
-              </w:rPr>
-              <w:t>’</w:t>
+              <w:t>Number of objects in ‘pObjects’</w:t>
             </w:r>
           </w:p>
         </w:tc>
@@ -3002,21 +2667,7 @@
               <w:rPr>
                 <w:lang w:eastAsia="en-AU"/>
               </w:rPr>
-              <w:t>‘</w:t>
-            </w:r>
-            <w:proofErr w:type="spellStart"/>
-            <w:r>
-              <w:rPr>
-                <w:lang w:eastAsia="en-AU"/>
-              </w:rPr>
-              <w:t>pUserData</w:t>
-            </w:r>
-            <w:proofErr w:type="spellEnd"/>
-            <w:r>
-              <w:rPr>
-                <w:lang w:eastAsia="en-AU"/>
-              </w:rPr>
-              <w:t>’ is a pointer that is specified during the setup of the message callback, and allows us to pass our own data to it</w:t>
+              <w:t>‘pUserData’ is a pointer that is specified during the setup of the message callback, and allows us to pass our own data to it</w:t>
             </w:r>
           </w:p>
         </w:tc>
@@ -3081,35 +2732,7 @@
         <w:rPr>
           <w:lang w:eastAsia="en-AU"/>
         </w:rPr>
-        <w:t>Since Vulkan is platform agnostic, we need to use a specific extension to render to the GLFW window, for Windows this is the ‘Window System Integration (WSI)’ extension. For rendering at all we also need the ‘</w:t>
-      </w:r>
-      <w:proofErr w:type="spellStart"/>
-      <w:r>
-        <w:rPr>
-          <w:lang w:eastAsia="en-AU"/>
-        </w:rPr>
-        <w:t>VK_KHR_surface</w:t>
-      </w:r>
-      <w:proofErr w:type="spellEnd"/>
-      <w:r>
-        <w:rPr>
-          <w:lang w:eastAsia="en-AU"/>
-        </w:rPr>
-        <w:t>’ extension, which exposes a ‘</w:t>
-      </w:r>
-      <w:proofErr w:type="spellStart"/>
-      <w:r>
-        <w:rPr>
-          <w:lang w:eastAsia="en-AU"/>
-        </w:rPr>
-        <w:t>VkSurfaceKHR</w:t>
-      </w:r>
-      <w:proofErr w:type="spellEnd"/>
-      <w:r>
-        <w:rPr>
-          <w:lang w:eastAsia="en-AU"/>
-        </w:rPr>
-        <w:t xml:space="preserve">’ for presenting rendered images to. The reason the surface is separate to the window is because Vulkan by default allows for off-screen rendering, unlike in OpenGL where you need </w:t>
+        <w:t xml:space="preserve">Since Vulkan is platform agnostic, we need to use a specific extension to render to the GLFW window, for Windows this is the ‘Window System Integration (WSI)’ extension. For rendering at all we also need the ‘VK_KHR_surface’ extension, which exposes a ‘VkSurfaceKHR’ for presenting rendered images to. The reason the surface is separate to the window is because Vulkan by default allows for off-screen rendering, unlike in OpenGL where you need </w:t>
       </w:r>
       <w:r>
         <w:rPr>
@@ -3188,21 +2811,7 @@
         <w:rPr>
           <w:lang w:eastAsia="en-AU"/>
         </w:rPr>
-        <w:t xml:space="preserve"> Luckily, GLFW abstracts this away for us in the ‘</w:t>
-      </w:r>
-      <w:proofErr w:type="spellStart"/>
-      <w:r>
-        <w:rPr>
-          <w:lang w:eastAsia="en-AU"/>
-        </w:rPr>
-        <w:t>glfwCreateWindowSurface</w:t>
-      </w:r>
-      <w:proofErr w:type="spellEnd"/>
-      <w:r>
-        <w:rPr>
-          <w:lang w:eastAsia="en-AU"/>
-        </w:rPr>
-        <w:t>’ function, so our code can remain platform agnostic.</w:t>
+        <w:t xml:space="preserve"> Luckily, GLFW abstracts this away for us in the ‘glfwCreateWindowSurface’ function, so our code can remain platform agnostic.</w:t>
       </w:r>
       <w:r>
         <w:rPr>
@@ -4493,21 +4102,7 @@
         <w:rPr>
           <w:lang w:eastAsia="en-AU"/>
         </w:rPr>
-        <w:t>When creating shader stages you can use the member ‘</w:t>
-      </w:r>
-      <w:proofErr w:type="spellStart"/>
-      <w:r>
-        <w:rPr>
-          <w:lang w:eastAsia="en-AU"/>
-        </w:rPr>
-        <w:t>pSpecializationInfo</w:t>
-      </w:r>
-      <w:proofErr w:type="spellEnd"/>
-      <w:r>
-        <w:rPr>
-          <w:lang w:eastAsia="en-AU"/>
-        </w:rPr>
-        <w:t xml:space="preserve">’ to specify values for shader constants. </w:t>
+        <w:t xml:space="preserve">When creating shader stages you can use the member ‘pSpecializationInfo’ to specify values for shader constants. </w:t>
       </w:r>
       <w:r>
         <w:rPr>
@@ -5139,14 +4734,12 @@
           <w:lang w:eastAsia="en-AU"/>
         </w:rPr>
       </w:pPr>
-      <w:proofErr w:type="spellStart"/>
       <w:r>
         <w:rPr>
           <w:lang w:eastAsia="en-AU"/>
         </w:rPr>
         <w:t>depthClampEnable</w:t>
       </w:r>
-      <w:proofErr w:type="spellEnd"/>
     </w:p>
     <w:p>
       <w:pPr>
@@ -5177,14 +4770,12 @@
           <w:lang w:eastAsia="en-AU"/>
         </w:rPr>
       </w:pPr>
-      <w:proofErr w:type="spellStart"/>
       <w:r>
         <w:rPr>
           <w:lang w:eastAsia="en-AU"/>
         </w:rPr>
         <w:t>rasterizerDiscardEnable</w:t>
       </w:r>
-      <w:proofErr w:type="spellEnd"/>
     </w:p>
     <w:p>
       <w:pPr>
@@ -5221,14 +4812,12 @@
           <w:lang w:eastAsia="en-AU"/>
         </w:rPr>
       </w:pPr>
-      <w:proofErr w:type="spellStart"/>
       <w:r>
         <w:rPr>
           <w:lang w:eastAsia="en-AU"/>
         </w:rPr>
         <w:t>polygonMode</w:t>
       </w:r>
-      <w:proofErr w:type="spellEnd"/>
     </w:p>
     <w:p>
       <w:pPr>
@@ -5329,21 +4918,7 @@
         <w:rPr>
           <w:lang w:eastAsia="en-AU"/>
         </w:rPr>
-        <w:t>How thick lines are drawn, this requires the ‘</w:t>
-      </w:r>
-      <w:proofErr w:type="spellStart"/>
-      <w:r>
-        <w:rPr>
-          <w:lang w:eastAsia="en-AU"/>
-        </w:rPr>
-        <w:t>wideLines</w:t>
-      </w:r>
-      <w:proofErr w:type="spellEnd"/>
-      <w:r>
-        <w:rPr>
-          <w:lang w:eastAsia="en-AU"/>
-        </w:rPr>
-        <w:t>’ GPU feature</w:t>
+        <w:t>How thick lines are drawn, this requires the ‘wideLines’ GPU feature</w:t>
       </w:r>
     </w:p>
     <w:p>
@@ -5357,14 +4932,12 @@
           <w:lang w:eastAsia="en-AU"/>
         </w:rPr>
       </w:pPr>
-      <w:proofErr w:type="spellStart"/>
       <w:r>
         <w:rPr>
           <w:lang w:eastAsia="en-AU"/>
         </w:rPr>
         <w:t>cullMode</w:t>
       </w:r>
-      <w:proofErr w:type="spellEnd"/>
     </w:p>
     <w:p>
       <w:pPr>
@@ -5443,14 +5016,12 @@
           <w:lang w:eastAsia="en-AU"/>
         </w:rPr>
       </w:pPr>
-      <w:proofErr w:type="spellStart"/>
       <w:r>
         <w:rPr>
           <w:lang w:eastAsia="en-AU"/>
         </w:rPr>
         <w:t>frontFace</w:t>
       </w:r>
-      <w:proofErr w:type="spellEnd"/>
     </w:p>
     <w:p>
       <w:pPr>
@@ -5493,14 +5064,12 @@
           <w:lang w:eastAsia="en-AU"/>
         </w:rPr>
       </w:pPr>
-      <w:proofErr w:type="spellStart"/>
       <w:r>
         <w:rPr>
           <w:lang w:eastAsia="en-AU"/>
         </w:rPr>
         <w:t>depthBiasEnable</w:t>
       </w:r>
-      <w:proofErr w:type="spellEnd"/>
     </w:p>
     <w:p>
       <w:pPr>
@@ -5705,76 +5274,20 @@
         <w:rPr>
           <w:lang w:eastAsia="en-AU"/>
         </w:rPr>
-        <w:t>There are two types of struct that configure this called ‘</w:t>
-      </w:r>
-      <w:proofErr w:type="spellStart"/>
-      <w:r>
-        <w:rPr>
-          <w:lang w:eastAsia="en-AU"/>
-        </w:rPr>
-        <w:t>VkPipelineColorBlend</w:t>
-      </w:r>
-      <w:proofErr w:type="spellEnd"/>
-      <w:r>
-        <w:rPr>
-          <w:lang w:eastAsia="en-AU"/>
-        </w:rPr>
-        <w:t>…’; ‘…</w:t>
-      </w:r>
-      <w:proofErr w:type="spellStart"/>
-      <w:r>
-        <w:rPr>
-          <w:lang w:eastAsia="en-AU"/>
-        </w:rPr>
-        <w:t>AttachmentState</w:t>
-      </w:r>
-      <w:proofErr w:type="spellEnd"/>
-      <w:r>
-        <w:rPr>
-          <w:lang w:eastAsia="en-AU"/>
-        </w:rPr>
-        <w:t>’ for configuring per attached framebuffer and ‘…</w:t>
-      </w:r>
-      <w:proofErr w:type="spellStart"/>
-      <w:r>
-        <w:rPr>
-          <w:lang w:eastAsia="en-AU"/>
-        </w:rPr>
-        <w:t>StateCreateInfo</w:t>
-      </w:r>
-      <w:proofErr w:type="spellEnd"/>
-      <w:r>
-        <w:rPr>
-          <w:lang w:eastAsia="en-AU"/>
-        </w:rPr>
-        <w:t>’ for configuring a global colour blend.</w:t>
-      </w:r>
-    </w:p>
-    <w:p>
-      <w:pPr>
-        <w:rPr>
-          <w:lang w:eastAsia="en-AU"/>
-        </w:rPr>
-      </w:pPr>
-      <w:r>
-        <w:rPr>
-          <w:lang w:eastAsia="en-AU"/>
-        </w:rPr>
-        <w:t>If the ‘.</w:t>
-      </w:r>
-      <w:proofErr w:type="spellStart"/>
-      <w:r>
-        <w:rPr>
-          <w:lang w:eastAsia="en-AU"/>
-        </w:rPr>
-        <w:t>blendEnable</w:t>
-      </w:r>
-      <w:proofErr w:type="spellEnd"/>
-      <w:r>
-        <w:rPr>
-          <w:lang w:eastAsia="en-AU"/>
-        </w:rPr>
-        <w:t xml:space="preserve">’ is set to VK_FALSE, then </w:t>
+        <w:t>There are two types of struct that configure this called ‘VkPipelineColorBlend…’; ‘…AttachmentState’ for configuring per attached framebuffer and ‘…StateCreateInfo’ for configuring a global colour blend.</w:t>
+      </w:r>
+    </w:p>
+    <w:p>
+      <w:pPr>
+        <w:rPr>
+          <w:lang w:eastAsia="en-AU"/>
+        </w:rPr>
+      </w:pPr>
+      <w:r>
+        <w:rPr>
+          <w:lang w:eastAsia="en-AU"/>
+        </w:rPr>
+        <w:t xml:space="preserve">If the ‘.blendEnable’ is set to VK_FALSE, then </w:t>
       </w:r>
       <w:r>
         <w:rPr>
@@ -5993,14 +5506,12 @@
           <w:lang w:eastAsia="en-AU"/>
         </w:rPr>
       </w:pPr>
-      <w:proofErr w:type="spellStart"/>
       <w:r>
         <w:rPr>
           <w:lang w:eastAsia="en-AU"/>
         </w:rPr>
         <w:t>loadOp</w:t>
       </w:r>
-      <w:proofErr w:type="spellEnd"/>
     </w:p>
     <w:p>
       <w:pPr>
@@ -6166,7 +5677,6 @@
           <w:lang w:eastAsia="en-AU"/>
         </w:rPr>
       </w:pPr>
-      <w:proofErr w:type="spellStart"/>
       <w:r>
         <w:rPr>
           <w:lang w:eastAsia="en-AU"/>
@@ -6174,7 +5684,6 @@
         <w:lastRenderedPageBreak/>
         <w:t>storeOp</w:t>
       </w:r>
-      <w:proofErr w:type="spellEnd"/>
     </w:p>
     <w:p>
       <w:pPr>
@@ -6259,14 +5768,12 @@
           <w:lang w:eastAsia="en-AU"/>
         </w:rPr>
       </w:pPr>
-      <w:proofErr w:type="spellStart"/>
       <w:r>
         <w:rPr>
           <w:lang w:eastAsia="en-AU"/>
         </w:rPr>
         <w:t>stencilLoadOp</w:t>
       </w:r>
-      <w:proofErr w:type="spellEnd"/>
     </w:p>
     <w:p>
       <w:pPr>
@@ -6283,21 +5790,7 @@
         <w:rPr>
           <w:lang w:eastAsia="en-AU"/>
         </w:rPr>
-        <w:t>Same as ‘</w:t>
-      </w:r>
-      <w:proofErr w:type="spellStart"/>
-      <w:r>
-        <w:rPr>
-          <w:lang w:eastAsia="en-AU"/>
-        </w:rPr>
-        <w:t>loadOp</w:t>
-      </w:r>
-      <w:proofErr w:type="spellEnd"/>
-      <w:r>
-        <w:rPr>
-          <w:lang w:eastAsia="en-AU"/>
-        </w:rPr>
-        <w:t>’ but only for stencil data</w:t>
+        <w:t>Same as ‘loadOp’ but only for stencil data</w:t>
       </w:r>
     </w:p>
     <w:p>
@@ -6311,14 +5804,12 @@
           <w:lang w:eastAsia="en-AU"/>
         </w:rPr>
       </w:pPr>
-      <w:proofErr w:type="spellStart"/>
       <w:r>
         <w:rPr>
           <w:lang w:eastAsia="en-AU"/>
         </w:rPr>
         <w:t>stencilStoreOp</w:t>
       </w:r>
-      <w:proofErr w:type="spellEnd"/>
     </w:p>
     <w:p>
       <w:pPr>
@@ -6335,21 +5826,7 @@
         <w:rPr>
           <w:lang w:eastAsia="en-AU"/>
         </w:rPr>
-        <w:t>Same as ‘</w:t>
-      </w:r>
-      <w:proofErr w:type="spellStart"/>
-      <w:r>
-        <w:rPr>
-          <w:lang w:eastAsia="en-AU"/>
-        </w:rPr>
-        <w:t>storeOp</w:t>
-      </w:r>
-      <w:proofErr w:type="spellEnd"/>
-      <w:r>
-        <w:rPr>
-          <w:lang w:eastAsia="en-AU"/>
-        </w:rPr>
-        <w:t>’ but only for stencil data</w:t>
+        <w:t>Same as ‘storeOp’ but only for stencil data</w:t>
       </w:r>
     </w:p>
     <w:p>
@@ -6363,14 +5840,12 @@
           <w:lang w:eastAsia="en-AU"/>
         </w:rPr>
       </w:pPr>
-      <w:proofErr w:type="spellStart"/>
       <w:r>
         <w:rPr>
           <w:lang w:eastAsia="en-AU"/>
         </w:rPr>
         <w:t>initialLayout</w:t>
       </w:r>
-      <w:proofErr w:type="spellEnd"/>
     </w:p>
     <w:p>
       <w:pPr>
@@ -6503,14 +5978,12 @@
           <w:lang w:eastAsia="en-AU"/>
         </w:rPr>
       </w:pPr>
-      <w:proofErr w:type="spellStart"/>
       <w:r>
         <w:rPr>
           <w:lang w:eastAsia="en-AU"/>
         </w:rPr>
         <w:t>finalLayout</w:t>
       </w:r>
-      <w:proofErr w:type="spellEnd"/>
     </w:p>
     <w:p>
       <w:pPr>
@@ -6539,21 +6012,7 @@
         <w:rPr>
           <w:lang w:eastAsia="en-AU"/>
         </w:rPr>
-        <w:t>‘</w:t>
-      </w:r>
-      <w:proofErr w:type="spellStart"/>
-      <w:r>
-        <w:rPr>
-          <w:lang w:eastAsia="en-AU"/>
-        </w:rPr>
-        <w:t>initialLayout</w:t>
-      </w:r>
-      <w:proofErr w:type="spellEnd"/>
-      <w:r>
-        <w:rPr>
-          <w:lang w:eastAsia="en-AU"/>
-        </w:rPr>
-        <w:t>’</w:t>
+        <w:t>‘initialLayout’</w:t>
       </w:r>
     </w:p>
     <w:p>
@@ -6604,21 +6063,7 @@
         <w:rPr>
           <w:lang w:eastAsia="en-AU"/>
         </w:rPr>
-        <w:t>through a ‘</w:t>
-      </w:r>
-      <w:proofErr w:type="spellStart"/>
-      <w:r>
-        <w:rPr>
-          <w:lang w:eastAsia="en-AU"/>
-        </w:rPr>
-        <w:t>VkSubpassDescription</w:t>
-      </w:r>
-      <w:proofErr w:type="spellEnd"/>
-      <w:r>
-        <w:rPr>
-          <w:lang w:eastAsia="en-AU"/>
-        </w:rPr>
-        <w:t>’ which has the following members:</w:t>
+        <w:t>through a ‘VkSubpassDescription’ which has the following members:</w:t>
       </w:r>
     </w:p>
     <w:p>
@@ -6632,19 +6077,11 @@
           <w:lang w:eastAsia="en-AU"/>
         </w:rPr>
       </w:pPr>
-      <w:proofErr w:type="spellStart"/>
-      <w:r>
-        <w:rPr>
-          <w:lang w:eastAsia="en-AU"/>
-        </w:rPr>
-        <w:t>pipelineBindPoint</w:t>
-      </w:r>
-      <w:proofErr w:type="spellEnd"/>
-      <w:r>
-        <w:rPr>
-          <w:lang w:eastAsia="en-AU"/>
-        </w:rPr>
-        <w:t xml:space="preserve"> (whether it is a compute or graphics sub-pass)</w:t>
+      <w:r>
+        <w:rPr>
+          <w:lang w:eastAsia="en-AU"/>
+        </w:rPr>
+        <w:t>pipelineBindPoint (whether it is a compute or graphics sub-pass)</w:t>
       </w:r>
     </w:p>
     <w:p>
@@ -6658,19 +6095,11 @@
           <w:lang w:eastAsia="en-AU"/>
         </w:rPr>
       </w:pPr>
-      <w:proofErr w:type="spellStart"/>
-      <w:r>
-        <w:rPr>
-          <w:lang w:eastAsia="en-AU"/>
-        </w:rPr>
-        <w:t>colorAttachmentCount</w:t>
-      </w:r>
-      <w:proofErr w:type="spellEnd"/>
-      <w:r>
-        <w:rPr>
-          <w:lang w:eastAsia="en-AU"/>
-        </w:rPr>
-        <w:t xml:space="preserve"> (how many colour attachments are there?)</w:t>
+      <w:r>
+        <w:rPr>
+          <w:lang w:eastAsia="en-AU"/>
+        </w:rPr>
+        <w:t>colorAttachmentCount (how many colour attachments are there?)</w:t>
       </w:r>
     </w:p>
     <w:p>
@@ -6684,19 +6113,11 @@
           <w:lang w:eastAsia="en-AU"/>
         </w:rPr>
       </w:pPr>
-      <w:proofErr w:type="spellStart"/>
-      <w:r>
-        <w:rPr>
-          <w:lang w:eastAsia="en-AU"/>
-        </w:rPr>
-        <w:t>pColorAttachments</w:t>
-      </w:r>
-      <w:proofErr w:type="spellEnd"/>
-      <w:r>
-        <w:rPr>
-          <w:lang w:eastAsia="en-AU"/>
-        </w:rPr>
-        <w:t xml:space="preserve"> (colour attachments array)</w:t>
+      <w:r>
+        <w:rPr>
+          <w:lang w:eastAsia="en-AU"/>
+        </w:rPr>
+        <w:t>pColorAttachments (colour attachments array)</w:t>
       </w:r>
     </w:p>
     <w:p>
@@ -6710,19 +6131,11 @@
           <w:lang w:eastAsia="en-AU"/>
         </w:rPr>
       </w:pPr>
-      <w:proofErr w:type="spellStart"/>
-      <w:r>
-        <w:rPr>
-          <w:lang w:eastAsia="en-AU"/>
-        </w:rPr>
-        <w:t>pInputAttachments</w:t>
-      </w:r>
-      <w:proofErr w:type="spellEnd"/>
-      <w:r>
-        <w:rPr>
-          <w:lang w:eastAsia="en-AU"/>
-        </w:rPr>
-        <w:t xml:space="preserve"> (attachments read from a shader)</w:t>
+      <w:r>
+        <w:rPr>
+          <w:lang w:eastAsia="en-AU"/>
+        </w:rPr>
+        <w:t>pInputAttachments (attachments read from a shader)</w:t>
       </w:r>
     </w:p>
     <w:p>
@@ -6736,19 +6149,11 @@
           <w:lang w:eastAsia="en-AU"/>
         </w:rPr>
       </w:pPr>
-      <w:proofErr w:type="spellStart"/>
-      <w:r>
-        <w:rPr>
-          <w:lang w:eastAsia="en-AU"/>
-        </w:rPr>
-        <w:t>pResolveAttachments</w:t>
-      </w:r>
-      <w:proofErr w:type="spellEnd"/>
-      <w:r>
-        <w:rPr>
-          <w:lang w:eastAsia="en-AU"/>
-        </w:rPr>
-        <w:t xml:space="preserve"> (attachments used for multisampling colour attachments)</w:t>
+      <w:r>
+        <w:rPr>
+          <w:lang w:eastAsia="en-AU"/>
+        </w:rPr>
+        <w:t>pResolveAttachments (attachments used for multisampling colour attachments)</w:t>
       </w:r>
     </w:p>
     <w:p>
@@ -6762,19 +6167,11 @@
           <w:lang w:eastAsia="en-AU"/>
         </w:rPr>
       </w:pPr>
-      <w:proofErr w:type="spellStart"/>
-      <w:r>
-        <w:rPr>
-          <w:lang w:eastAsia="en-AU"/>
-        </w:rPr>
-        <w:t>pDepthStencilAttachment</w:t>
-      </w:r>
-      <w:proofErr w:type="spellEnd"/>
-      <w:r>
-        <w:rPr>
-          <w:lang w:eastAsia="en-AU"/>
-        </w:rPr>
-        <w:t xml:space="preserve"> (attachment for depth and stencil data)</w:t>
+      <w:r>
+        <w:rPr>
+          <w:lang w:eastAsia="en-AU"/>
+        </w:rPr>
+        <w:t>pDepthStencilAttachment (attachment for depth and stencil data)</w:t>
       </w:r>
     </w:p>
     <w:p>
@@ -6788,19 +6185,11 @@
           <w:lang w:eastAsia="en-AU"/>
         </w:rPr>
       </w:pPr>
-      <w:proofErr w:type="spellStart"/>
-      <w:r>
-        <w:rPr>
-          <w:lang w:eastAsia="en-AU"/>
-        </w:rPr>
-        <w:t>pPreserveAttachments</w:t>
-      </w:r>
-      <w:proofErr w:type="spellEnd"/>
-      <w:r>
-        <w:rPr>
-          <w:lang w:eastAsia="en-AU"/>
-        </w:rPr>
-        <w:t xml:space="preserve"> (attachments not used for this sub-pass, but their data should be preserved for other sub-passes)</w:t>
+      <w:r>
+        <w:rPr>
+          <w:lang w:eastAsia="en-AU"/>
+        </w:rPr>
+        <w:t>pPreserveAttachments (attachments not used for this sub-pass, but their data should be preserved for other sub-passes)</w:t>
       </w:r>
     </w:p>
     <w:p>
@@ -7044,35 +6433,7 @@
         <w:rPr>
           <w:lang w:eastAsia="en-AU"/>
         </w:rPr>
-        <w:t>The attachments specified during render pass creation are bound in a ‘</w:t>
-      </w:r>
-      <w:proofErr w:type="spellStart"/>
-      <w:r>
-        <w:rPr>
-          <w:lang w:eastAsia="en-AU"/>
-        </w:rPr>
-        <w:t>VkFramebuffer</w:t>
-      </w:r>
-      <w:proofErr w:type="spellEnd"/>
-      <w:r>
-        <w:rPr>
-          <w:lang w:eastAsia="en-AU"/>
-        </w:rPr>
-        <w:t>’ object. This object references all ‘</w:t>
-      </w:r>
-      <w:proofErr w:type="spellStart"/>
-      <w:r>
-        <w:rPr>
-          <w:lang w:eastAsia="en-AU"/>
-        </w:rPr>
-        <w:t>VkImageView</w:t>
-      </w:r>
-      <w:proofErr w:type="spellEnd"/>
-      <w:r>
-        <w:rPr>
-          <w:lang w:eastAsia="en-AU"/>
-        </w:rPr>
-        <w:t xml:space="preserve">’ </w:t>
+        <w:t xml:space="preserve">The attachments specified during render pass creation are bound in a ‘VkFramebuffer’ object. This object references all ‘VkImageView’ </w:t>
       </w:r>
       <w:r>
         <w:rPr>
@@ -7592,48 +6953,20 @@
         <w:rPr>
           <w:lang w:eastAsia="en-AU"/>
         </w:rPr>
-        <w:t>There is also a ‘</w:t>
-      </w:r>
-      <w:proofErr w:type="spellStart"/>
-      <w:r>
-        <w:rPr>
-          <w:lang w:eastAsia="en-AU"/>
-        </w:rPr>
-        <w:t>pInheritanceInfo</w:t>
-      </w:r>
-      <w:proofErr w:type="spellEnd"/>
-      <w:r>
-        <w:rPr>
-          <w:lang w:eastAsia="en-AU"/>
-        </w:rPr>
-        <w:t>’ member that is only relevant to secondary command buffers. It specifies which state to inherit from the calling primary command buffers.</w:t>
-      </w:r>
-    </w:p>
-    <w:p>
-      <w:pPr>
-        <w:rPr>
-          <w:lang w:eastAsia="en-AU"/>
-        </w:rPr>
-      </w:pPr>
-      <w:r>
-        <w:rPr>
-          <w:lang w:eastAsia="en-AU"/>
-        </w:rPr>
-        <w:t>If the command buffer was already recorded, then a call to ‘</w:t>
-      </w:r>
-      <w:proofErr w:type="spellStart"/>
-      <w:r>
-        <w:rPr>
-          <w:lang w:eastAsia="en-AU"/>
-        </w:rPr>
-        <w:t>vkBeginCommandBuffer</w:t>
-      </w:r>
-      <w:proofErr w:type="spellEnd"/>
-      <w:r>
-        <w:rPr>
-          <w:lang w:eastAsia="en-AU"/>
-        </w:rPr>
-        <w:t xml:space="preserve">’ will reset it. It is not possible to append commands to a buffer </w:t>
+        <w:t>There is also a ‘pInheritanceInfo’ member that is only relevant to secondary command buffers. It specifies which state to inherit from the calling primary command buffers.</w:t>
+      </w:r>
+    </w:p>
+    <w:p>
+      <w:pPr>
+        <w:rPr>
+          <w:lang w:eastAsia="en-AU"/>
+        </w:rPr>
+      </w:pPr>
+      <w:r>
+        <w:rPr>
+          <w:lang w:eastAsia="en-AU"/>
+        </w:rPr>
+        <w:t xml:space="preserve">If the command buffer was already recorded, then a call to ‘vkBeginCommandBuffer’ will reset it. It is not possible to append commands to a buffer </w:t>
       </w:r>
       <w:r>
         <w:rPr>
@@ -7671,21 +7004,7 @@
         <w:rPr>
           <w:lang w:eastAsia="en-AU"/>
         </w:rPr>
-        <w:t>functions that record commands can be recognized by their ‘</w:t>
-      </w:r>
-      <w:proofErr w:type="spellStart"/>
-      <w:r>
-        <w:rPr>
-          <w:lang w:eastAsia="en-AU"/>
-        </w:rPr>
-        <w:t>vkCmd</w:t>
-      </w:r>
-      <w:proofErr w:type="spellEnd"/>
-      <w:r>
-        <w:rPr>
-          <w:lang w:eastAsia="en-AU"/>
-        </w:rPr>
-        <w:t xml:space="preserve">’ prefix. </w:t>
+        <w:t xml:space="preserve">functions that record commands can be recognized by their ‘vkCmd’ prefix. </w:t>
       </w:r>
       <w:r>
         <w:rPr>
@@ -7810,19 +7129,11 @@
           <w:lang w:eastAsia="en-AU"/>
         </w:rPr>
       </w:pPr>
-      <w:proofErr w:type="spellStart"/>
-      <w:r>
-        <w:rPr>
-          <w:lang w:eastAsia="en-AU"/>
-        </w:rPr>
-        <w:t>vertexCount</w:t>
-      </w:r>
-      <w:proofErr w:type="spellEnd"/>
-      <w:r>
-        <w:rPr>
-          <w:lang w:eastAsia="en-AU"/>
-        </w:rPr>
-        <w:t xml:space="preserve"> (how many vertices are there?)</w:t>
+      <w:r>
+        <w:rPr>
+          <w:lang w:eastAsia="en-AU"/>
+        </w:rPr>
+        <w:t>vertexCount (how many vertices are there?)</w:t>
       </w:r>
     </w:p>
     <w:p>
@@ -7836,19 +7147,11 @@
           <w:lang w:eastAsia="en-AU"/>
         </w:rPr>
       </w:pPr>
-      <w:proofErr w:type="spellStart"/>
-      <w:r>
-        <w:rPr>
-          <w:lang w:eastAsia="en-AU"/>
-        </w:rPr>
-        <w:t>instanceCount</w:t>
-      </w:r>
-      <w:proofErr w:type="spellEnd"/>
-      <w:r>
-        <w:rPr>
-          <w:lang w:eastAsia="en-AU"/>
-        </w:rPr>
-        <w:t xml:space="preserve"> (how many instances are there?)</w:t>
+      <w:r>
+        <w:rPr>
+          <w:lang w:eastAsia="en-AU"/>
+        </w:rPr>
+        <w:t>instanceCount (how many instances are there?)</w:t>
       </w:r>
     </w:p>
     <w:p>
@@ -7862,19 +7165,11 @@
           <w:lang w:eastAsia="en-AU"/>
         </w:rPr>
       </w:pPr>
-      <w:proofErr w:type="spellStart"/>
-      <w:r>
-        <w:rPr>
-          <w:lang w:eastAsia="en-AU"/>
-        </w:rPr>
-        <w:t>firstVertex</w:t>
-      </w:r>
-      <w:proofErr w:type="spellEnd"/>
-      <w:r>
-        <w:rPr>
-          <w:lang w:eastAsia="en-AU"/>
-        </w:rPr>
-        <w:t xml:space="preserve"> (index offset of the first vertex)</w:t>
+      <w:r>
+        <w:rPr>
+          <w:lang w:eastAsia="en-AU"/>
+        </w:rPr>
+        <w:t>firstVertex (index offset of the first vertex)</w:t>
       </w:r>
     </w:p>
     <w:p>
@@ -7888,19 +7183,11 @@
           <w:lang w:eastAsia="en-AU"/>
         </w:rPr>
       </w:pPr>
-      <w:proofErr w:type="spellStart"/>
-      <w:r>
-        <w:rPr>
-          <w:lang w:eastAsia="en-AU"/>
-        </w:rPr>
-        <w:t>firstInstance</w:t>
-      </w:r>
-      <w:proofErr w:type="spellEnd"/>
-      <w:r>
-        <w:rPr>
-          <w:lang w:eastAsia="en-AU"/>
-        </w:rPr>
-        <w:t xml:space="preserve"> (index offset of the first instance)</w:t>
+      <w:r>
+        <w:rPr>
+          <w:lang w:eastAsia="en-AU"/>
+        </w:rPr>
+        <w:t>firstInstance (index offset of the first instance)</w:t>
       </w:r>
     </w:p>
     <w:p>
@@ -8236,21 +7523,7 @@
         <w:rPr>
           <w:lang w:eastAsia="en-AU"/>
         </w:rPr>
-        <w:t>A minor note, the call to ‘</w:t>
-      </w:r>
-      <w:proofErr w:type="spellStart"/>
-      <w:r>
-        <w:rPr>
-          <w:lang w:eastAsia="en-AU"/>
-        </w:rPr>
-        <w:t>vkQueueSubmit</w:t>
-      </w:r>
-      <w:proofErr w:type="spellEnd"/>
-      <w:r>
-        <w:rPr>
-          <w:lang w:eastAsia="en-AU"/>
-        </w:rPr>
-        <w:t xml:space="preserve">’ </w:t>
+        <w:t xml:space="preserve">A minor note, the call to ‘vkQueueSubmit’ </w:t>
       </w:r>
       <w:r>
         <w:rPr>
@@ -8354,21 +7627,7 @@
         <w:rPr>
           <w:lang w:eastAsia="en-AU"/>
         </w:rPr>
-        <w:t>Like semaphores, fences are either signalled or un-signalled. Whenever we call ‘</w:t>
-      </w:r>
-      <w:proofErr w:type="spellStart"/>
-      <w:r>
-        <w:rPr>
-          <w:lang w:eastAsia="en-AU"/>
-        </w:rPr>
-        <w:t>vkQueueSubmit</w:t>
-      </w:r>
-      <w:proofErr w:type="spellEnd"/>
-      <w:r>
-        <w:rPr>
-          <w:lang w:eastAsia="en-AU"/>
-        </w:rPr>
-        <w:t>’ we can attach a fence to the work, which will be signalled only when the work has been completed.</w:t>
+        <w:t>Like semaphores, fences are either signalled or un-signalled. Whenever we call ‘vkQueueSubmit’ we can attach a fence to the work, which will be signalled only when the work has been completed.</w:t>
       </w:r>
       <w:r>
         <w:rPr>
@@ -8647,28 +7906,12 @@
           <w:lang w:eastAsia="en-AU"/>
         </w:rPr>
       </w:pPr>
-      <w:proofErr w:type="spellStart"/>
-      <w:r>
-        <w:rPr>
-          <w:lang w:eastAsia="en-AU"/>
-        </w:rPr>
-        <w:t>srcSubpass</w:t>
-      </w:r>
-      <w:proofErr w:type="spellEnd"/>
-      <w:r>
-        <w:rPr>
-          <w:lang w:eastAsia="en-AU"/>
-        </w:rPr>
-        <w:t xml:space="preserve">, </w:t>
-      </w:r>
-      <w:proofErr w:type="spellStart"/>
-      <w:r>
-        <w:rPr>
-          <w:lang w:eastAsia="en-AU"/>
-        </w:rPr>
-        <w:t>dstSubpass</w:t>
-      </w:r>
-      <w:proofErr w:type="spellEnd"/>
+      <w:r>
+        <w:rPr>
+          <w:lang w:eastAsia="en-AU"/>
+        </w:rPr>
+        <w:t>srcSubpass, dstSubpass</w:t>
+      </w:r>
     </w:p>
     <w:p>
       <w:pPr>
@@ -8709,35 +7952,7 @@
         <w:rPr>
           <w:lang w:eastAsia="en-AU"/>
         </w:rPr>
-        <w:t xml:space="preserve">the implicit sub-passes before or after the render pass, </w:t>
-      </w:r>
-      <w:proofErr w:type="spellStart"/>
-      <w:r>
-        <w:rPr>
-          <w:lang w:eastAsia="en-AU"/>
-        </w:rPr>
-        <w:t>src</w:t>
-      </w:r>
-      <w:proofErr w:type="spellEnd"/>
-      <w:r>
-        <w:rPr>
-          <w:lang w:eastAsia="en-AU"/>
-        </w:rPr>
-        <w:t xml:space="preserve"> = before, </w:t>
-      </w:r>
-      <w:proofErr w:type="spellStart"/>
-      <w:r>
-        <w:rPr>
-          <w:lang w:eastAsia="en-AU"/>
-        </w:rPr>
-        <w:t>dst</w:t>
-      </w:r>
-      <w:proofErr w:type="spellEnd"/>
-      <w:r>
-        <w:rPr>
-          <w:lang w:eastAsia="en-AU"/>
-        </w:rPr>
-        <w:t xml:space="preserve"> = after</w:t>
+        <w:t>the implicit sub-passes before or after the render pass, src = before, dst = after</w:t>
       </w:r>
     </w:p>
     <w:p>
@@ -8769,28 +7984,12 @@
           <w:lang w:eastAsia="en-AU"/>
         </w:rPr>
       </w:pPr>
-      <w:proofErr w:type="spellStart"/>
-      <w:r>
-        <w:rPr>
-          <w:lang w:eastAsia="en-AU"/>
-        </w:rPr>
-        <w:t>dstSubpass</w:t>
-      </w:r>
-      <w:proofErr w:type="spellEnd"/>
-      <w:r>
-        <w:rPr>
-          <w:lang w:eastAsia="en-AU"/>
-        </w:rPr>
-        <w:t xml:space="preserve"> must always be higher than </w:t>
-      </w:r>
-      <w:proofErr w:type="spellStart"/>
-      <w:r>
-        <w:rPr>
-          <w:lang w:eastAsia="en-AU"/>
-        </w:rPr>
-        <w:t>srcSubpass</w:t>
-      </w:r>
-      <w:proofErr w:type="spellEnd"/>
+      <w:r>
+        <w:rPr>
+          <w:lang w:eastAsia="en-AU"/>
+        </w:rPr>
+        <w:t>dstSubpass must always be higher than srcSubpass</w:t>
+      </w:r>
       <w:r>
         <w:rPr>
           <w:lang w:eastAsia="en-AU"/>
@@ -8809,28 +8008,12 @@
           <w:lang w:eastAsia="en-AU"/>
         </w:rPr>
       </w:pPr>
-      <w:proofErr w:type="spellStart"/>
-      <w:r>
-        <w:rPr>
-          <w:lang w:eastAsia="en-AU"/>
-        </w:rPr>
-        <w:t>srcStageMask</w:t>
-      </w:r>
-      <w:proofErr w:type="spellEnd"/>
-      <w:r>
-        <w:rPr>
-          <w:lang w:eastAsia="en-AU"/>
-        </w:rPr>
-        <w:t xml:space="preserve">, </w:t>
-      </w:r>
-      <w:proofErr w:type="spellStart"/>
-      <w:r>
-        <w:rPr>
-          <w:lang w:eastAsia="en-AU"/>
-        </w:rPr>
-        <w:t>srcAccessMask</w:t>
-      </w:r>
-      <w:proofErr w:type="spellEnd"/>
+      <w:r>
+        <w:rPr>
+          <w:lang w:eastAsia="en-AU"/>
+        </w:rPr>
+        <w:t>srcStageMask, srcAccessMask</w:t>
+      </w:r>
     </w:p>
     <w:p>
       <w:pPr>
@@ -8861,28 +8044,12 @@
           <w:lang w:eastAsia="en-AU"/>
         </w:rPr>
       </w:pPr>
-      <w:proofErr w:type="spellStart"/>
-      <w:r>
-        <w:rPr>
-          <w:lang w:eastAsia="en-AU"/>
-        </w:rPr>
-        <w:t>dstStageMask</w:t>
-      </w:r>
-      <w:proofErr w:type="spellEnd"/>
-      <w:r>
-        <w:rPr>
-          <w:lang w:eastAsia="en-AU"/>
-        </w:rPr>
-        <w:t xml:space="preserve">, </w:t>
-      </w:r>
-      <w:proofErr w:type="spellStart"/>
-      <w:r>
-        <w:rPr>
-          <w:lang w:eastAsia="en-AU"/>
-        </w:rPr>
-        <w:t>dstAccessMask</w:t>
-      </w:r>
-      <w:proofErr w:type="spellEnd"/>
+      <w:r>
+        <w:rPr>
+          <w:lang w:eastAsia="en-AU"/>
+        </w:rPr>
+        <w:t>dstStageMask, dstAccessMask</w:t>
+      </w:r>
     </w:p>
     <w:p>
       <w:pPr>
@@ -8964,35 +8131,7 @@
         <w:rPr>
           <w:lang w:eastAsia="en-AU"/>
         </w:rPr>
-        <w:t>The ‘</w:t>
-      </w:r>
-      <w:proofErr w:type="spellStart"/>
-      <w:r>
-        <w:rPr>
-          <w:lang w:eastAsia="en-AU"/>
-        </w:rPr>
-        <w:t>vkAcqueueNextImageKHR</w:t>
-      </w:r>
-      <w:proofErr w:type="spellEnd"/>
-      <w:r>
-        <w:rPr>
-          <w:lang w:eastAsia="en-AU"/>
-        </w:rPr>
-        <w:t>’ and ‘</w:t>
-      </w:r>
-      <w:proofErr w:type="spellStart"/>
-      <w:r>
-        <w:rPr>
-          <w:lang w:eastAsia="en-AU"/>
-        </w:rPr>
-        <w:t>vkQueuePresentKHR</w:t>
-      </w:r>
-      <w:proofErr w:type="spellEnd"/>
-      <w:r>
-        <w:rPr>
-          <w:lang w:eastAsia="en-AU"/>
-        </w:rPr>
-        <w:t>’ functions can return special values to signify that the swap chain is no longer adequate:</w:t>
+        <w:t>The ‘vkAcqueueNextImageKHR’ and ‘vkQueuePresentKHR’ functions can return special values to signify that the swap chain is no longer adequate:</w:t>
       </w:r>
     </w:p>
     <w:p>
@@ -9234,69 +8373,13 @@
         <w:rPr>
           <w:lang w:eastAsia="en-AU"/>
         </w:rPr>
-        <w:t>, then the buffer may look like: [</w:t>
-      </w:r>
-      <w:proofErr w:type="spellStart"/>
-      <w:r>
-        <w:rPr>
-          <w:lang w:eastAsia="en-AU"/>
-        </w:rPr>
-        <w:t>ax</w:t>
-      </w:r>
-      <w:proofErr w:type="spellEnd"/>
-      <w:r>
-        <w:rPr>
-          <w:lang w:eastAsia="en-AU"/>
-        </w:rPr>
-        <w:t>,</w:t>
-      </w:r>
-      <w:r>
-        <w:rPr>
-          <w:lang w:eastAsia="en-AU"/>
-        </w:rPr>
-        <w:t xml:space="preserve"> ay, </w:t>
-      </w:r>
-      <w:proofErr w:type="spellStart"/>
-      <w:r>
-        <w:rPr>
-          <w:lang w:eastAsia="en-AU"/>
-        </w:rPr>
-        <w:t>ar</w:t>
-      </w:r>
-      <w:proofErr w:type="spellEnd"/>
-      <w:r>
-        <w:rPr>
-          <w:lang w:eastAsia="en-AU"/>
-        </w:rPr>
-        <w:t xml:space="preserve">, ag, ab, bx, by, </w:t>
-      </w:r>
-      <w:proofErr w:type="spellStart"/>
-      <w:r>
-        <w:rPr>
-          <w:lang w:eastAsia="en-AU"/>
-        </w:rPr>
-        <w:t>br</w:t>
-      </w:r>
-      <w:proofErr w:type="spellEnd"/>
-      <w:r>
-        <w:rPr>
-          <w:lang w:eastAsia="en-AU"/>
-        </w:rPr>
-        <w:t xml:space="preserve">, </w:t>
-      </w:r>
-      <w:proofErr w:type="spellStart"/>
-      <w:r>
-        <w:rPr>
-          <w:lang w:eastAsia="en-AU"/>
-        </w:rPr>
-        <w:t>bg</w:t>
-      </w:r>
-      <w:proofErr w:type="spellEnd"/>
-      <w:r>
-        <w:rPr>
-          <w:lang w:eastAsia="en-AU"/>
-        </w:rPr>
-        <w:t>, bb, …]</w:t>
+        <w:t>, then the buffer may look like: [ax,</w:t>
+      </w:r>
+      <w:r>
+        <w:rPr>
+          <w:lang w:eastAsia="en-AU"/>
+        </w:rPr>
+        <w:t xml:space="preserve"> ay, ar, ag, ab, bx, by, br, bg, bb, …]</w:t>
       </w:r>
     </w:p>
     <w:p>
@@ -9496,21 +8579,7 @@
         <w:rPr>
           <w:lang w:eastAsia="en-AU"/>
         </w:rPr>
-        <w:t xml:space="preserve">Format – describes the type of data for the attribute. These use the same </w:t>
-      </w:r>
-      <w:proofErr w:type="spellStart"/>
-      <w:r>
-        <w:rPr>
-          <w:lang w:eastAsia="en-AU"/>
-        </w:rPr>
-        <w:t>enum</w:t>
-      </w:r>
-      <w:proofErr w:type="spellEnd"/>
-      <w:r>
-        <w:rPr>
-          <w:lang w:eastAsia="en-AU"/>
-        </w:rPr>
-        <w:t xml:space="preserve"> as </w:t>
+        <w:t xml:space="preserve">Format – describes the type of data for the attribute. These use the same enum as </w:t>
       </w:r>
       <w:r>
         <w:rPr>
@@ -9576,21 +8645,7 @@
         <w:rPr>
           <w:lang w:eastAsia="en-AU"/>
         </w:rPr>
-        <w:t>specifies the number of bytes since the start of the per-vertex data that the attribute should read from, we can just use ‘</w:t>
-      </w:r>
-      <w:proofErr w:type="spellStart"/>
-      <w:r>
-        <w:rPr>
-          <w:lang w:eastAsia="en-AU"/>
-        </w:rPr>
-        <w:t>offsetof</w:t>
-      </w:r>
-      <w:proofErr w:type="spellEnd"/>
-      <w:r>
-        <w:rPr>
-          <w:lang w:eastAsia="en-AU"/>
-        </w:rPr>
-        <w:t>’ macro to get this for us</w:t>
+        <w:t>specifies the number of bytes since the start of the per-vertex data that the attribute should read from, we can just use ‘offsetof’ macro to get this for us</w:t>
       </w:r>
     </w:p>
     <w:p>
@@ -9798,21 +8853,7 @@
         <w:rPr>
           <w:lang w:eastAsia="en-AU"/>
         </w:rPr>
-        <w:t xml:space="preserve"> (</w:t>
-      </w:r>
-      <w:proofErr w:type="spellStart"/>
-      <w:r>
-        <w:rPr>
-          <w:lang w:eastAsia="en-AU"/>
-        </w:rPr>
-        <w:t>xor</w:t>
-      </w:r>
-      <w:proofErr w:type="spellEnd"/>
-      <w:r>
-        <w:rPr>
-          <w:lang w:eastAsia="en-AU"/>
-        </w:rPr>
-        <w:t>)</w:t>
+        <w:t xml:space="preserve"> (xor)</w:t>
       </w:r>
     </w:p>
     <w:p>
@@ -9826,14 +8867,12 @@
           <w:lang w:eastAsia="en-AU"/>
         </w:rPr>
       </w:pPr>
-      <w:proofErr w:type="spellStart"/>
       <w:r>
         <w:rPr>
           <w:lang w:eastAsia="en-AU"/>
         </w:rPr>
         <w:t>sharingMode</w:t>
       </w:r>
-      <w:proofErr w:type="spellEnd"/>
     </w:p>
     <w:p>
       <w:pPr>
@@ -9936,41 +8975,13 @@
         <w:rPr>
           <w:lang w:eastAsia="en-AU"/>
         </w:rPr>
-        <w:t>using ‘</w:t>
-      </w:r>
-      <w:proofErr w:type="spellStart"/>
-      <w:r>
-        <w:rPr>
-          <w:lang w:eastAsia="en-AU"/>
-        </w:rPr>
-        <w:t>vkGetBufferMemoryRequirements</w:t>
-      </w:r>
-      <w:proofErr w:type="spellEnd"/>
-      <w:r>
-        <w:rPr>
-          <w:lang w:eastAsia="en-AU"/>
-        </w:rPr>
-        <w:t>’</w:t>
-      </w:r>
-      <w:r>
-        <w:rPr>
-          <w:lang w:eastAsia="en-AU"/>
-        </w:rPr>
-        <w:t>. This fills a ‘</w:t>
-      </w:r>
-      <w:proofErr w:type="spellStart"/>
-      <w:r>
-        <w:rPr>
-          <w:lang w:eastAsia="en-AU"/>
-        </w:rPr>
-        <w:t>VkMemoryRequirements</w:t>
-      </w:r>
-      <w:proofErr w:type="spellEnd"/>
-      <w:r>
-        <w:rPr>
-          <w:lang w:eastAsia="en-AU"/>
-        </w:rPr>
-        <w:t>’ object, which has 3 members:</w:t>
+        <w:t>using ‘vkGetBufferMemoryRequirements’</w:t>
+      </w:r>
+      <w:r>
+        <w:rPr>
+          <w:lang w:eastAsia="en-AU"/>
+        </w:rPr>
+        <w:t>. This fills a ‘VkMemoryRequirements’ object, which has 3 members:</w:t>
       </w:r>
     </w:p>
     <w:p>
@@ -10006,21 +9017,7 @@
         <w:rPr>
           <w:lang w:eastAsia="en-AU"/>
         </w:rPr>
-        <w:t xml:space="preserve">Size of the required memory in bytes (may differ from </w:t>
-      </w:r>
-      <w:proofErr w:type="spellStart"/>
-      <w:r>
-        <w:rPr>
-          <w:lang w:eastAsia="en-AU"/>
-        </w:rPr>
-        <w:t>bufferInfo.size</w:t>
-      </w:r>
-      <w:proofErr w:type="spellEnd"/>
-      <w:r>
-        <w:rPr>
-          <w:lang w:eastAsia="en-AU"/>
-        </w:rPr>
-        <w:t>)</w:t>
+        <w:t>Size of the required memory in bytes (may differ from bufferInfo.size)</w:t>
       </w:r>
     </w:p>
     <w:p>
@@ -10056,23 +9053,8 @@
         <w:rPr>
           <w:lang w:eastAsia="en-AU"/>
         </w:rPr>
-        <w:t xml:space="preserve">Offset in bytes where the buffer begins in the allocated memory region (this depends on the </w:t>
-      </w:r>
-      <w:proofErr w:type="spellStart"/>
-      <w:r>
-        <w:rPr>
-          <w:lang w:eastAsia="en-AU"/>
-        </w:rPr>
-        <w:t>bufferInfo.usage</w:t>
-      </w:r>
-      <w:proofErr w:type="spellEnd"/>
-      <w:r>
-        <w:rPr>
-          <w:lang w:eastAsia="en-AU"/>
-        </w:rPr>
-        <w:t xml:space="preserve"> and </w:t>
-      </w:r>
-      <w:proofErr w:type="spellStart"/>
+        <w:t xml:space="preserve">Offset in bytes where the buffer begins in the allocated memory region (this depends on the bufferInfo.usage and </w:t>
+      </w:r>
       <w:r>
         <w:rPr>
           <w:lang w:eastAsia="en-AU"/>
@@ -10083,14 +9065,7 @@
         <w:rPr>
           <w:lang w:eastAsia="en-AU"/>
         </w:rPr>
-        <w:t>.flags</w:t>
-      </w:r>
-      <w:proofErr w:type="spellEnd"/>
-      <w:r>
-        <w:rPr>
-          <w:lang w:eastAsia="en-AU"/>
-        </w:rPr>
-        <w:t>)</w:t>
+        <w:t>.flags)</w:t>
       </w:r>
     </w:p>
     <w:p>
@@ -10104,14 +9079,12 @@
           <w:lang w:eastAsia="en-AU"/>
         </w:rPr>
       </w:pPr>
-      <w:proofErr w:type="spellStart"/>
       <w:r>
         <w:rPr>
           <w:lang w:eastAsia="en-AU"/>
         </w:rPr>
         <w:t>memoryTypeBits</w:t>
       </w:r>
-      <w:proofErr w:type="spellEnd"/>
     </w:p>
     <w:p>
       <w:pPr>
@@ -10148,21 +9121,7 @@
         <w:rPr>
           <w:lang w:eastAsia="en-AU"/>
         </w:rPr>
-        <w:t>‘</w:t>
-      </w:r>
-      <w:proofErr w:type="spellStart"/>
-      <w:r>
-        <w:rPr>
-          <w:lang w:eastAsia="en-AU"/>
-        </w:rPr>
-        <w:t>VkPhysicalDeviceMemoryProperties</w:t>
-      </w:r>
-      <w:proofErr w:type="spellEnd"/>
-      <w:r>
-        <w:rPr>
-          <w:lang w:eastAsia="en-AU"/>
-        </w:rPr>
-        <w:t>’ struct has two arrays:</w:t>
+        <w:t>‘VkPhysicalDeviceMemoryProperties’ struct has two arrays:</w:t>
       </w:r>
     </w:p>
     <w:p>
@@ -10176,14 +9135,12 @@
           <w:lang w:eastAsia="en-AU"/>
         </w:rPr>
       </w:pPr>
-      <w:proofErr w:type="spellStart"/>
       <w:r>
         <w:rPr>
           <w:lang w:eastAsia="en-AU"/>
         </w:rPr>
         <w:t>memoryTypes</w:t>
       </w:r>
-      <w:proofErr w:type="spellEnd"/>
     </w:p>
     <w:p>
       <w:pPr>
@@ -10196,14 +9153,12 @@
           <w:lang w:eastAsia="en-AU"/>
         </w:rPr>
       </w:pPr>
-      <w:proofErr w:type="spellStart"/>
       <w:r>
         <w:rPr>
           <w:lang w:eastAsia="en-AU"/>
         </w:rPr>
         <w:t>memoryHeaps</w:t>
       </w:r>
-      <w:proofErr w:type="spellEnd"/>
     </w:p>
     <w:p>
       <w:pPr>
@@ -10258,61 +9213,19 @@
         <w:rPr>
           <w:lang w:eastAsia="en-AU"/>
         </w:rPr>
-        <w:t>start by mapping buffer memory into CPU memory via ‘</w:t>
-      </w:r>
-      <w:proofErr w:type="spellStart"/>
-      <w:r>
-        <w:rPr>
-          <w:lang w:eastAsia="en-AU"/>
-        </w:rPr>
-        <w:t>vkMapMemory</w:t>
-      </w:r>
-      <w:proofErr w:type="spellEnd"/>
-      <w:r>
-        <w:rPr>
-          <w:lang w:eastAsia="en-AU"/>
-        </w:rPr>
-        <w:t xml:space="preserve">’. </w:t>
-      </w:r>
-      <w:r>
-        <w:rPr>
-          <w:lang w:eastAsia="en-AU"/>
-        </w:rPr>
-        <w:t xml:space="preserve">Then </w:t>
-      </w:r>
-      <w:proofErr w:type="spellStart"/>
-      <w:r>
-        <w:rPr>
-          <w:lang w:eastAsia="en-AU"/>
-        </w:rPr>
-        <w:t>memcpy</w:t>
-      </w:r>
-      <w:proofErr w:type="spellEnd"/>
-      <w:r>
-        <w:rPr>
-          <w:lang w:eastAsia="en-AU"/>
-        </w:rPr>
-        <w:t xml:space="preserve"> the vertex data </w:t>
-      </w:r>
-      <w:r>
-        <w:rPr>
-          <w:lang w:eastAsia="en-AU"/>
-        </w:rPr>
-        <w:t>into the mapped memory. And finally un-mapping the memory via ‘</w:t>
-      </w:r>
-      <w:proofErr w:type="spellStart"/>
-      <w:r>
-        <w:rPr>
-          <w:lang w:eastAsia="en-AU"/>
-        </w:rPr>
-        <w:t>vkUnmapMemory</w:t>
-      </w:r>
-      <w:proofErr w:type="spellEnd"/>
-      <w:r>
-        <w:rPr>
-          <w:lang w:eastAsia="en-AU"/>
-        </w:rPr>
-        <w:t>’.</w:t>
+        <w:t xml:space="preserve">start by mapping buffer memory into CPU memory via ‘vkMapMemory’. </w:t>
+      </w:r>
+      <w:r>
+        <w:rPr>
+          <w:lang w:eastAsia="en-AU"/>
+        </w:rPr>
+        <w:t xml:space="preserve">Then memcpy the vertex data </w:t>
+      </w:r>
+      <w:r>
+        <w:rPr>
+          <w:lang w:eastAsia="en-AU"/>
+        </w:rPr>
+        <w:t>into the mapped memory. And finally un-mapping the memory via ‘vkUnmapMemory’.</w:t>
       </w:r>
     </w:p>
     <w:p>
@@ -10399,21 +9312,7 @@
         <w:rPr>
           <w:lang w:eastAsia="en-AU"/>
         </w:rPr>
-        <w:t>Finally, to bind the buffer at draw time, use the command ‘</w:t>
-      </w:r>
-      <w:proofErr w:type="spellStart"/>
-      <w:r>
-        <w:rPr>
-          <w:lang w:eastAsia="en-AU"/>
-        </w:rPr>
-        <w:t>vkCmdBindVertexBuffers</w:t>
-      </w:r>
-      <w:proofErr w:type="spellEnd"/>
-      <w:r>
-        <w:rPr>
-          <w:lang w:eastAsia="en-AU"/>
-        </w:rPr>
-        <w:t>’.</w:t>
+        <w:t>Finally, to bind the buffer at draw time, use the command ‘vkCmdBindVertexBuffers’.</w:t>
       </w:r>
     </w:p>
     <w:p>
@@ -10624,21 +9523,7 @@
         <w:rPr>
           <w:lang w:eastAsia="en-AU"/>
         </w:rPr>
-        <w:t>Buffers allocated from device local memory usually can’t be mapped to via ‘</w:t>
-      </w:r>
-      <w:proofErr w:type="spellStart"/>
-      <w:r>
-        <w:rPr>
-          <w:lang w:eastAsia="en-AU"/>
-        </w:rPr>
-        <w:t>vkMapMemory</w:t>
-      </w:r>
-      <w:proofErr w:type="spellEnd"/>
-      <w:r>
-        <w:rPr>
-          <w:lang w:eastAsia="en-AU"/>
-        </w:rPr>
-        <w:t>’</w:t>
+        <w:t>Buffers allocated from device local memory usually can’t be mapped to via ‘vkMapMemory’</w:t>
       </w:r>
       <w:r>
         <w:rPr>
@@ -10723,21 +9608,7 @@
         <w:rPr>
           <w:lang w:eastAsia="en-AU"/>
         </w:rPr>
-        <w:t>We use ‘</w:t>
-      </w:r>
-      <w:proofErr w:type="spellStart"/>
-      <w:r>
-        <w:rPr>
-          <w:lang w:eastAsia="en-AU"/>
-        </w:rPr>
-        <w:t>vkCmdCopyBuffer</w:t>
-      </w:r>
-      <w:proofErr w:type="spellEnd"/>
-      <w:r>
-        <w:rPr>
-          <w:lang w:eastAsia="en-AU"/>
-        </w:rPr>
-        <w:t>’</w:t>
+        <w:t>We use ‘vkCmdCopyBuffer’</w:t>
       </w:r>
       <w:r>
         <w:rPr>
@@ -10775,35 +9646,7 @@
         <w:rPr>
           <w:lang w:eastAsia="en-AU"/>
         </w:rPr>
-        <w:t>It should be noted that calling ‘</w:t>
-      </w:r>
-      <w:proofErr w:type="spellStart"/>
-      <w:r>
-        <w:rPr>
-          <w:lang w:eastAsia="en-AU"/>
-        </w:rPr>
-        <w:t>vkAllocateMemory</w:t>
-      </w:r>
-      <w:proofErr w:type="spellEnd"/>
-      <w:r>
-        <w:rPr>
-          <w:lang w:eastAsia="en-AU"/>
-        </w:rPr>
-        <w:t>’ for every individual buffer is not optimal, as there is a ‘</w:t>
-      </w:r>
-      <w:proofErr w:type="spellStart"/>
-      <w:r>
-        <w:rPr>
-          <w:lang w:eastAsia="en-AU"/>
-        </w:rPr>
-        <w:t>maxMemoryAllocationCount</w:t>
-      </w:r>
-      <w:proofErr w:type="spellEnd"/>
-      <w:r>
-        <w:rPr>
-          <w:lang w:eastAsia="en-AU"/>
-        </w:rPr>
-        <w:t xml:space="preserve">’. The correct approach is when allocating memory for a large number of objects is to create a custom allocator that splits up a single allocation among multiple objects by </w:t>
+        <w:t xml:space="preserve">It should be noted that calling ‘vkAllocateMemory’ for every individual buffer is not optimal, as there is a ‘maxMemoryAllocationCount’. The correct approach is when allocating memory for a large number of objects is to create a custom allocator that splits up a single allocation among multiple objects by </w:t>
       </w:r>
       <w:r>
         <w:rPr>
@@ -10822,21 +9665,7 @@
         <w:rPr>
           <w:lang w:eastAsia="en-AU"/>
         </w:rPr>
-        <w:t>There is a ‘</w:t>
-      </w:r>
-      <w:proofErr w:type="spellStart"/>
-      <w:r>
-        <w:rPr>
-          <w:lang w:eastAsia="en-AU"/>
-        </w:rPr>
-        <w:t>VulkanMemoryAllocator</w:t>
-      </w:r>
-      <w:proofErr w:type="spellEnd"/>
-      <w:r>
-        <w:rPr>
-          <w:lang w:eastAsia="en-AU"/>
-        </w:rPr>
-        <w:t xml:space="preserve">’ </w:t>
+        <w:t xml:space="preserve">There is a ‘VulkanMemoryAllocator’ </w:t>
       </w:r>
       <w:r>
         <w:rPr>
@@ -11006,21 +9835,7 @@
         <w:rPr>
           <w:lang w:eastAsia="en-AU"/>
         </w:rPr>
-        <w:t xml:space="preserve">We </w:t>
-      </w:r>
-      <w:proofErr w:type="spellStart"/>
-      <w:r>
-        <w:rPr>
-          <w:lang w:eastAsia="en-AU"/>
-        </w:rPr>
-        <w:t>can not</w:t>
-      </w:r>
-      <w:proofErr w:type="spellEnd"/>
-      <w:r>
-        <w:rPr>
-          <w:lang w:eastAsia="en-AU"/>
-        </w:rPr>
-        <w:t xml:space="preserve"> use different indices for each vertex attribute, so we </w:t>
+        <w:t xml:space="preserve">We can not use different indices for each vertex attribute, so we </w:t>
       </w:r>
       <w:r>
         <w:rPr>
@@ -11086,21 +9901,7 @@
         <w:rPr>
           <w:lang w:eastAsia="en-AU"/>
         </w:rPr>
-        <w:t xml:space="preserve">, you </w:t>
-      </w:r>
-      <w:proofErr w:type="spellStart"/>
-      <w:r>
-        <w:rPr>
-          <w:lang w:eastAsia="en-AU"/>
-        </w:rPr>
-        <w:t>can not</w:t>
-      </w:r>
-      <w:proofErr w:type="spellEnd"/>
-      <w:r>
-        <w:rPr>
-          <w:lang w:eastAsia="en-AU"/>
-        </w:rPr>
-        <w:t xml:space="preserve"> save data by re-using individual attributes.</w:t>
+        <w:t>, you can not save data by re-using individual attributes.</w:t>
       </w:r>
     </w:p>
     <w:p>
@@ -11150,21 +9951,7 @@
         <w:rPr>
           <w:lang w:eastAsia="en-AU"/>
         </w:rPr>
-        <w:t xml:space="preserve">If you store both the vertex and index buffers into a single </w:t>
-      </w:r>
-      <w:proofErr w:type="spellStart"/>
-      <w:r>
-        <w:rPr>
-          <w:lang w:eastAsia="en-AU"/>
-        </w:rPr>
-        <w:t>VkBuffer</w:t>
-      </w:r>
-      <w:proofErr w:type="spellEnd"/>
-      <w:r>
-        <w:rPr>
-          <w:lang w:eastAsia="en-AU"/>
-        </w:rPr>
-        <w:t xml:space="preserve">, you can </w:t>
+        <w:t xml:space="preserve">If you store both the vertex and index buffers into a single VkBuffer, you can </w:t>
       </w:r>
       <w:r>
         <w:rPr>
@@ -11618,14 +10405,12 @@
           <w:lang w:eastAsia="en-AU"/>
         </w:rPr>
       </w:pPr>
-      <w:proofErr w:type="spellStart"/>
       <w:r>
         <w:rPr>
           <w:lang w:eastAsia="en-AU"/>
         </w:rPr>
         <w:t>descriptorType</w:t>
       </w:r>
-      <w:proofErr w:type="spellEnd"/>
     </w:p>
     <w:p>
       <w:pPr>
@@ -11638,14 +10423,12 @@
           <w:lang w:eastAsia="en-AU"/>
         </w:rPr>
       </w:pPr>
-      <w:proofErr w:type="spellStart"/>
       <w:r>
         <w:rPr>
           <w:lang w:eastAsia="en-AU"/>
         </w:rPr>
         <w:t>descriptorCount</w:t>
       </w:r>
-      <w:proofErr w:type="spellEnd"/>
     </w:p>
     <w:p>
       <w:pPr>
@@ -11676,14 +10459,12 @@
           <w:lang w:eastAsia="en-AU"/>
         </w:rPr>
       </w:pPr>
-      <w:proofErr w:type="spellStart"/>
       <w:r>
         <w:rPr>
           <w:lang w:eastAsia="en-AU"/>
         </w:rPr>
         <w:t>stageFlags</w:t>
       </w:r>
-      <w:proofErr w:type="spellEnd"/>
     </w:p>
     <w:p>
       <w:pPr>
@@ -11732,14 +10513,12 @@
           <w:lang w:eastAsia="en-AU"/>
         </w:rPr>
       </w:pPr>
-      <w:proofErr w:type="spellStart"/>
       <w:r>
         <w:rPr>
           <w:lang w:eastAsia="en-AU"/>
         </w:rPr>
         <w:t>pImmutableSamplers</w:t>
       </w:r>
-      <w:proofErr w:type="spellEnd"/>
     </w:p>
     <w:p>
       <w:pPr>
@@ -11810,21 +10589,7 @@
         <w:rPr>
           <w:lang w:eastAsia="en-AU"/>
         </w:rPr>
-        <w:t xml:space="preserve">Descriptor set layouts describe the type of descriptors that can be bound, but they </w:t>
-      </w:r>
-      <w:proofErr w:type="spellStart"/>
-      <w:r>
-        <w:rPr>
-          <w:lang w:eastAsia="en-AU"/>
-        </w:rPr>
-        <w:t>can not</w:t>
-      </w:r>
-      <w:proofErr w:type="spellEnd"/>
-      <w:r>
-        <w:rPr>
-          <w:lang w:eastAsia="en-AU"/>
-        </w:rPr>
-        <w:t xml:space="preserve"> be created directly, they </w:t>
+        <w:t xml:space="preserve">Descriptor set layouts describe the type of descriptors that can be bound, but they can not be created directly, they </w:t>
       </w:r>
       <w:r>
         <w:rPr>
@@ -11885,21 +10650,7 @@
         <w:rPr>
           <w:lang w:eastAsia="en-AU"/>
         </w:rPr>
-        <w:t>To use the descriptor sets, you need to bind them before calling draw commands, using ‘</w:t>
-      </w:r>
-      <w:proofErr w:type="spellStart"/>
-      <w:r>
-        <w:rPr>
-          <w:lang w:eastAsia="en-AU"/>
-        </w:rPr>
-        <w:t>vkCmdBindDescriptorSets</w:t>
-      </w:r>
-      <w:proofErr w:type="spellEnd"/>
-      <w:r>
-        <w:rPr>
-          <w:lang w:eastAsia="en-AU"/>
-        </w:rPr>
-        <w:t>’.</w:t>
+        <w:t>To use the descriptor sets, you need to bind them before calling draw commands, using ‘vkCmdBindDescriptorSets’.</w:t>
       </w:r>
       <w:r>
         <w:rPr>
@@ -12194,21 +10945,7 @@
         <w:rPr>
           <w:lang w:eastAsia="en-AU"/>
         </w:rPr>
-        <w:t>To fix this, it is recommended to always specify ‘</w:t>
-      </w:r>
-      <w:proofErr w:type="spellStart"/>
-      <w:r>
-        <w:rPr>
-          <w:lang w:eastAsia="en-AU"/>
-        </w:rPr>
-        <w:t>alignas</w:t>
-      </w:r>
-      <w:proofErr w:type="spellEnd"/>
-      <w:r>
-        <w:rPr>
-          <w:lang w:eastAsia="en-AU"/>
-        </w:rPr>
-        <w:t xml:space="preserve">’ before </w:t>
+        <w:t xml:space="preserve">To fix this, it is recommended to always specify ‘alignas’ before </w:t>
       </w:r>
       <w:r>
         <w:rPr>
@@ -12994,21 +11731,7 @@
         <w:rPr>
           <w:lang w:eastAsia="en-AU"/>
         </w:rPr>
-        <w:t>As source in a transfer operation, like ‘</w:t>
-      </w:r>
-      <w:proofErr w:type="spellStart"/>
-      <w:r>
-        <w:rPr>
-          <w:lang w:eastAsia="en-AU"/>
-        </w:rPr>
-        <w:t>vkCmdCopyImageToBuffer</w:t>
-      </w:r>
-      <w:proofErr w:type="spellEnd"/>
-      <w:r>
-        <w:rPr>
-          <w:lang w:eastAsia="en-AU"/>
-        </w:rPr>
-        <w:t>’</w:t>
+        <w:t>As source in a transfer operation, like ‘vkCmdCopyImageToBuffer’</w:t>
       </w:r>
     </w:p>
     <w:p>
@@ -13044,21 +11767,7 @@
         <w:rPr>
           <w:lang w:eastAsia="en-AU"/>
         </w:rPr>
-        <w:t>As destination in a transfer operation, like ‘</w:t>
-      </w:r>
-      <w:proofErr w:type="spellStart"/>
-      <w:r>
-        <w:rPr>
-          <w:lang w:eastAsia="en-AU"/>
-        </w:rPr>
-        <w:t>vkCmdCopyBufferToImage</w:t>
-      </w:r>
-      <w:proofErr w:type="spellEnd"/>
-      <w:r>
-        <w:rPr>
-          <w:lang w:eastAsia="en-AU"/>
-        </w:rPr>
-        <w:t>’</w:t>
+        <w:t>As destination in a transfer operation, like ‘vkCmdCopyBufferToImage’</w:t>
       </w:r>
     </w:p>
     <w:p>
@@ -13126,21 +11835,7 @@
         <w:rPr>
           <w:lang w:eastAsia="en-AU"/>
         </w:rPr>
-        <w:t>A very common library to load images is ‘</w:t>
-      </w:r>
-      <w:proofErr w:type="spellStart"/>
-      <w:r>
-        <w:rPr>
-          <w:lang w:eastAsia="en-AU"/>
-        </w:rPr>
-        <w:t>stb_image</w:t>
-      </w:r>
-      <w:proofErr w:type="spellEnd"/>
-      <w:r>
-        <w:rPr>
-          <w:lang w:eastAsia="en-AU"/>
-        </w:rPr>
-        <w:t xml:space="preserve">’ which is a single header library that you can find </w:t>
+        <w:t xml:space="preserve">A very common library to load images is ‘stb_image’ which is a single header library that you can find </w:t>
       </w:r>
       <w:hyperlink r:id="rId18" w:history="1">
         <w:r>
@@ -13174,21 +11869,7 @@
         <w:rPr>
           <w:lang w:eastAsia="en-AU"/>
         </w:rPr>
-        <w:t>but it is easier (and faster) to use a ‘</w:t>
-      </w:r>
-      <w:proofErr w:type="spellStart"/>
-      <w:r>
-        <w:rPr>
-          <w:lang w:eastAsia="en-AU"/>
-        </w:rPr>
-        <w:t>VkImage</w:t>
-      </w:r>
-      <w:proofErr w:type="spellEnd"/>
-      <w:r>
-        <w:rPr>
-          <w:lang w:eastAsia="en-AU"/>
-        </w:rPr>
-        <w:t xml:space="preserve">’ object. </w:t>
+        <w:t xml:space="preserve">but it is easier (and faster) to use a ‘VkImage’ object. </w:t>
       </w:r>
       <w:r>
         <w:rPr>
@@ -13335,14 +12016,12 @@
           <w:lang w:eastAsia="en-AU"/>
         </w:rPr>
       </w:pPr>
-      <w:proofErr w:type="spellStart"/>
       <w:r>
         <w:rPr>
           <w:lang w:eastAsia="en-AU"/>
         </w:rPr>
         <w:t>initialLayout</w:t>
       </w:r>
-      <w:proofErr w:type="spellEnd"/>
     </w:p>
     <w:p>
       <w:pPr>
@@ -13498,21 +12177,7 @@
         <w:rPr>
           <w:lang w:eastAsia="en-AU"/>
         </w:rPr>
-        <w:t>If you need to debug which specific object is not being cleaned up correctly, Vulkan will output the type name, i.e. ‘</w:t>
-      </w:r>
-      <w:proofErr w:type="spellStart"/>
-      <w:r>
-        <w:rPr>
-          <w:lang w:eastAsia="en-AU"/>
-        </w:rPr>
-        <w:t>VkDeviceMemory</w:t>
-      </w:r>
-      <w:proofErr w:type="spellEnd"/>
-      <w:r>
-        <w:rPr>
-          <w:lang w:eastAsia="en-AU"/>
-        </w:rPr>
-        <w:t xml:space="preserve">’. You then can attach a </w:t>
+        <w:t xml:space="preserve">If you need to debug which specific object is not being cleaned up correctly, Vulkan will output the type name, i.e. ‘VkDeviceMemory’. You then can attach a </w:t>
       </w:r>
       <w:r>
         <w:rPr>
@@ -14058,21 +12723,7 @@
         <w:rPr>
           <w:lang w:eastAsia="en-AU"/>
         </w:rPr>
-        <w:t xml:space="preserve">When creating a texture sampler, it is not attached to / nor references a </w:t>
-      </w:r>
-      <w:proofErr w:type="spellStart"/>
-      <w:r>
-        <w:rPr>
-          <w:lang w:eastAsia="en-AU"/>
-        </w:rPr>
-        <w:t>VkImage</w:t>
-      </w:r>
-      <w:proofErr w:type="spellEnd"/>
-      <w:r>
-        <w:rPr>
-          <w:lang w:eastAsia="en-AU"/>
-        </w:rPr>
-        <w:t xml:space="preserve"> object. </w:t>
+        <w:t xml:space="preserve">When creating a texture sampler, it is not attached to / nor references a VkImage object. </w:t>
       </w:r>
       <w:r>
         <w:rPr>
@@ -14177,21 +12828,7 @@
         <w:rPr>
           <w:lang w:eastAsia="en-AU"/>
         </w:rPr>
-        <w:t>is available in an ‘</w:t>
-      </w:r>
-      <w:proofErr w:type="spellStart"/>
-      <w:r>
-        <w:rPr>
-          <w:lang w:eastAsia="en-AU"/>
-        </w:rPr>
-        <w:t>IsDeviceSuitable</w:t>
-      </w:r>
-      <w:proofErr w:type="spellEnd"/>
-      <w:r>
-        <w:rPr>
-          <w:lang w:eastAsia="en-AU"/>
-        </w:rPr>
-        <w:t>’ function.</w:t>
+        <w:t>is available in an ‘IsDeviceSuitable’ function.</w:t>
       </w:r>
     </w:p>
     <w:p>
@@ -14239,21 +12876,7 @@
         <w:rPr>
           <w:lang w:eastAsia="en-AU"/>
         </w:rPr>
-        <w:t>The ‘</w:t>
-      </w:r>
-      <w:proofErr w:type="spellStart"/>
-      <w:r>
-        <w:rPr>
-          <w:lang w:eastAsia="en-AU"/>
-        </w:rPr>
-        <w:t>stageFlags</w:t>
-      </w:r>
-      <w:proofErr w:type="spellEnd"/>
-      <w:r>
-        <w:rPr>
-          <w:lang w:eastAsia="en-AU"/>
-        </w:rPr>
-        <w:t>’ when creating the descriptor set layout is usually set to fragment bit, for sampling textures, but it can also be used in the vertex stage for deformations like heightmaps.</w:t>
+        <w:t>The ‘stageFlags’ when creating the descriptor set layout is usually set to fragment bit, for sampling textures, but it can also be used in the vertex stage for deformations like heightmaps.</w:t>
       </w:r>
     </w:p>
     <w:p>
@@ -14310,21 +12933,7 @@
         <w:rPr>
           <w:lang w:eastAsia="en-AU"/>
         </w:rPr>
-        <w:t>, and ‘</w:t>
-      </w:r>
-      <w:proofErr w:type="spellStart"/>
-      <w:r>
-        <w:rPr>
-          <w:lang w:eastAsia="en-AU"/>
-        </w:rPr>
-        <w:t>samplerYD</w:t>
-      </w:r>
-      <w:proofErr w:type="spellEnd"/>
-      <w:r>
-        <w:rPr>
-          <w:lang w:eastAsia="en-AU"/>
-        </w:rPr>
-        <w:t>’ can be sampler1D, sampler2D or sampler3D</w:t>
+        <w:t>, and ‘samplerYD’ can be sampler1D, sampler2D or sampler3D</w:t>
       </w:r>
       <w:r>
         <w:rPr>
@@ -14805,21 +13414,7 @@
         <w:rPr>
           <w:lang w:eastAsia="en-AU"/>
         </w:rPr>
-        <w:t xml:space="preserve">The most common way of loading models is through a *.obj file, using a library like </w:t>
-      </w:r>
-      <w:proofErr w:type="spellStart"/>
-      <w:r>
-        <w:rPr>
-          <w:lang w:eastAsia="en-AU"/>
-        </w:rPr>
-        <w:t>tinyobjloader</w:t>
-      </w:r>
-      <w:proofErr w:type="spellEnd"/>
-      <w:r>
-        <w:rPr>
-          <w:lang w:eastAsia="en-AU"/>
-        </w:rPr>
-        <w:t xml:space="preserve">, which you can get </w:t>
+        <w:t xml:space="preserve">The most common way of loading models is through a *.obj file, using a library like tinyobjloader, which you can get </w:t>
       </w:r>
       <w:hyperlink r:id="rId22" w:history="1">
         <w:r>
@@ -14896,21 +13491,7 @@
         <w:rPr>
           <w:lang w:eastAsia="en-AU"/>
         </w:rPr>
-        <w:t xml:space="preserve">The </w:t>
-      </w:r>
-      <w:proofErr w:type="spellStart"/>
-      <w:r>
-        <w:rPr>
-          <w:lang w:eastAsia="en-AU"/>
-        </w:rPr>
-        <w:t>attrib</w:t>
-      </w:r>
-      <w:proofErr w:type="spellEnd"/>
-      <w:r>
-        <w:rPr>
-          <w:lang w:eastAsia="en-AU"/>
-        </w:rPr>
-        <w:t xml:space="preserve"> container holds all attributes (positions, normals, UVs). The shapes container holds all separate objects and their faces. </w:t>
+        <w:t xml:space="preserve">The attrib container holds all attributes (positions, normals, UVs). The shapes container holds all separate objects and their faces. </w:t>
       </w:r>
       <w:r>
         <w:rPr>
@@ -14929,118 +13510,20 @@
         <w:rPr>
           <w:lang w:eastAsia="en-AU"/>
         </w:rPr>
-        <w:t xml:space="preserve">It should be noted that the </w:t>
-      </w:r>
-      <w:proofErr w:type="spellStart"/>
-      <w:r>
-        <w:rPr>
-          <w:lang w:eastAsia="en-AU"/>
-        </w:rPr>
-        <w:t>LoadObj</w:t>
-      </w:r>
-      <w:proofErr w:type="spellEnd"/>
-      <w:r>
-        <w:rPr>
-          <w:lang w:eastAsia="en-AU"/>
-        </w:rPr>
-        <w:t xml:space="preserve"> function of </w:t>
-      </w:r>
-      <w:proofErr w:type="spellStart"/>
-      <w:r>
-        <w:rPr>
-          <w:lang w:eastAsia="en-AU"/>
-        </w:rPr>
-        <w:t>tinyobj</w:t>
-      </w:r>
-      <w:proofErr w:type="spellEnd"/>
-      <w:r>
-        <w:rPr>
-          <w:lang w:eastAsia="en-AU"/>
-        </w:rPr>
-        <w:t xml:space="preserve"> defaults to triangulating faces.</w:t>
-      </w:r>
-    </w:p>
-    <w:p>
-      <w:pPr>
-        <w:rPr>
-          <w:lang w:eastAsia="en-AU"/>
-        </w:rPr>
-      </w:pPr>
-      <w:r>
-        <w:rPr>
-          <w:lang w:eastAsia="en-AU"/>
-        </w:rPr>
-        <w:t xml:space="preserve">A </w:t>
-      </w:r>
-      <w:proofErr w:type="spellStart"/>
-      <w:r>
-        <w:rPr>
-          <w:lang w:eastAsia="en-AU"/>
-        </w:rPr>
-        <w:t>tinyobj</w:t>
-      </w:r>
-      <w:proofErr w:type="spellEnd"/>
-      <w:r>
-        <w:rPr>
-          <w:lang w:eastAsia="en-AU"/>
-        </w:rPr>
-        <w:t>::</w:t>
-      </w:r>
-      <w:proofErr w:type="spellStart"/>
-      <w:r>
-        <w:rPr>
-          <w:lang w:eastAsia="en-AU"/>
-        </w:rPr>
-        <w:t>index_t</w:t>
-      </w:r>
-      <w:proofErr w:type="spellEnd"/>
-      <w:r>
-        <w:rPr>
-          <w:lang w:eastAsia="en-AU"/>
-        </w:rPr>
-        <w:t xml:space="preserve"> contains the </w:t>
-      </w:r>
-      <w:proofErr w:type="spellStart"/>
-      <w:r>
-        <w:rPr>
-          <w:lang w:eastAsia="en-AU"/>
-        </w:rPr>
-        <w:t>vertex_index</w:t>
-      </w:r>
-      <w:proofErr w:type="spellEnd"/>
-      <w:r>
-        <w:rPr>
-          <w:lang w:eastAsia="en-AU"/>
-        </w:rPr>
-        <w:t xml:space="preserve">, </w:t>
-      </w:r>
-      <w:proofErr w:type="spellStart"/>
-      <w:r>
-        <w:rPr>
-          <w:lang w:eastAsia="en-AU"/>
-        </w:rPr>
-        <w:t>normal_index</w:t>
-      </w:r>
-      <w:proofErr w:type="spellEnd"/>
-      <w:r>
-        <w:rPr>
-          <w:lang w:eastAsia="en-AU"/>
-        </w:rPr>
-        <w:t xml:space="preserve"> and </w:t>
-      </w:r>
-      <w:proofErr w:type="spellStart"/>
-      <w:r>
-        <w:rPr>
-          <w:lang w:eastAsia="en-AU"/>
-        </w:rPr>
-        <w:t>texcoord_index</w:t>
-      </w:r>
-      <w:proofErr w:type="spellEnd"/>
-      <w:r>
-        <w:rPr>
-          <w:lang w:eastAsia="en-AU"/>
-        </w:rPr>
-        <w:t xml:space="preserve"> which we can use to look up </w:t>
+        <w:t>It should be noted that the LoadObj function of tinyobj defaults to triangulating faces.</w:t>
+      </w:r>
+    </w:p>
+    <w:p>
+      <w:pPr>
+        <w:rPr>
+          <w:lang w:eastAsia="en-AU"/>
+        </w:rPr>
+      </w:pPr>
+      <w:r>
+        <w:rPr>
+          <w:lang w:eastAsia="en-AU"/>
+        </w:rPr>
+        <w:t xml:space="preserve">A tinyobj::index_t contains the vertex_index, normal_index and texcoord_index which we can use to look up </w:t>
       </w:r>
       <w:r>
         <w:rPr>
@@ -15361,69 +13844,13 @@
         <w:rPr>
           <w:lang w:eastAsia="en-AU"/>
         </w:rPr>
-        <w:t>In Vulkan, each ‘</w:t>
-      </w:r>
-      <w:proofErr w:type="spellStart"/>
-      <w:r>
-        <w:rPr>
-          <w:lang w:eastAsia="en-AU"/>
-        </w:rPr>
-        <w:t>mip</w:t>
-      </w:r>
-      <w:proofErr w:type="spellEnd"/>
-      <w:r>
-        <w:rPr>
-          <w:lang w:eastAsia="en-AU"/>
-        </w:rPr>
-        <w:t xml:space="preserve"> level’ after 0 is referred to as the ‘</w:t>
-      </w:r>
-      <w:proofErr w:type="spellStart"/>
-      <w:r>
-        <w:rPr>
-          <w:lang w:eastAsia="en-AU"/>
-        </w:rPr>
-        <w:t>mip</w:t>
-      </w:r>
-      <w:proofErr w:type="spellEnd"/>
-      <w:r>
-        <w:rPr>
-          <w:lang w:eastAsia="en-AU"/>
-        </w:rPr>
-        <w:t xml:space="preserve"> chain’. </w:t>
-      </w:r>
-      <w:r>
-        <w:rPr>
-          <w:lang w:eastAsia="en-AU"/>
-        </w:rPr>
-        <w:t xml:space="preserve">The number of </w:t>
-      </w:r>
-      <w:proofErr w:type="spellStart"/>
-      <w:r>
-        <w:rPr>
-          <w:lang w:eastAsia="en-AU"/>
-        </w:rPr>
-        <w:t>mip</w:t>
-      </w:r>
-      <w:proofErr w:type="spellEnd"/>
-      <w:r>
-        <w:rPr>
-          <w:lang w:eastAsia="en-AU"/>
-        </w:rPr>
-        <w:t xml:space="preserve"> levels is set when a </w:t>
-      </w:r>
-      <w:proofErr w:type="spellStart"/>
-      <w:r>
-        <w:rPr>
-          <w:lang w:eastAsia="en-AU"/>
-        </w:rPr>
-        <w:t>VkImage</w:t>
-      </w:r>
-      <w:proofErr w:type="spellEnd"/>
-      <w:r>
-        <w:rPr>
-          <w:lang w:eastAsia="en-AU"/>
-        </w:rPr>
-        <w:t xml:space="preserve"> is </w:t>
+        <w:t xml:space="preserve">In Vulkan, each ‘mip level’ after 0 is referred to as the ‘mip chain’. </w:t>
+      </w:r>
+      <w:r>
+        <w:rPr>
+          <w:lang w:eastAsia="en-AU"/>
+        </w:rPr>
+        <w:t xml:space="preserve">The number of mip levels is set when a VkImage is </w:t>
       </w:r>
       <w:r>
         <w:rPr>
@@ -15450,33 +13877,11 @@
         </w:rPr>
         <w:t xml:space="preserve">To generate </w:t>
       </w:r>
-      <w:proofErr w:type="spellStart"/>
-      <w:r>
-        <w:rPr>
-          <w:lang w:eastAsia="en-AU"/>
-        </w:rPr>
-        <w:t>mip</w:t>
-      </w:r>
-      <w:proofErr w:type="spellEnd"/>
-      <w:r>
-        <w:rPr>
-          <w:lang w:eastAsia="en-AU"/>
-        </w:rPr>
-        <w:t xml:space="preserve"> levels, we use the ‘</w:t>
-      </w:r>
-      <w:proofErr w:type="spellStart"/>
-      <w:r>
-        <w:rPr>
-          <w:lang w:eastAsia="en-AU"/>
-        </w:rPr>
-        <w:t>vkCmdBlitImage</w:t>
-      </w:r>
-      <w:proofErr w:type="spellEnd"/>
-      <w:r>
-        <w:rPr>
-          <w:lang w:eastAsia="en-AU"/>
-        </w:rPr>
-        <w:t>’ command.</w:t>
+      <w:r>
+        <w:rPr>
+          <w:lang w:eastAsia="en-AU"/>
+        </w:rPr>
+        <w:t>mip levels, we use the ‘vkCmdBlitImage’ command.</w:t>
       </w:r>
       <w:r>
         <w:rPr>
@@ -15488,21 +13893,7 @@
         <w:rPr>
           <w:lang w:eastAsia="en-AU"/>
         </w:rPr>
-        <w:t>performs the copying, scaling, and filtering operations. We simply call this command for each level to ‘</w:t>
-      </w:r>
-      <w:proofErr w:type="spellStart"/>
-      <w:r>
-        <w:rPr>
-          <w:lang w:eastAsia="en-AU"/>
-        </w:rPr>
-        <w:t>blit</w:t>
-      </w:r>
-      <w:proofErr w:type="spellEnd"/>
-      <w:r>
-        <w:rPr>
-          <w:lang w:eastAsia="en-AU"/>
-        </w:rPr>
-        <w:t>’ the data to our texture image.</w:t>
+        <w:t>performs the copying, scaling, and filtering operations. We simply call this command for each level to ‘blit’ the data to our texture image.</w:t>
       </w:r>
       <w:r>
         <w:rPr>
@@ -15552,21 +13943,7 @@
         <w:rPr>
           <w:lang w:eastAsia="en-AU"/>
         </w:rPr>
-        <w:t xml:space="preserve">Linear filtering is not guaranteed to be supported on all platforms, so when generating </w:t>
-      </w:r>
-      <w:proofErr w:type="spellStart"/>
-      <w:r>
-        <w:rPr>
-          <w:lang w:eastAsia="en-AU"/>
-        </w:rPr>
-        <w:t>mip</w:t>
-      </w:r>
-      <w:proofErr w:type="spellEnd"/>
-      <w:r>
-        <w:rPr>
-          <w:lang w:eastAsia="en-AU"/>
-        </w:rPr>
-        <w:t xml:space="preserve"> levels we should always double check </w:t>
+        <w:t xml:space="preserve">Linear filtering is not guaranteed to be supported on all platforms, so when generating mip levels we should always double check </w:t>
       </w:r>
       <w:r>
         <w:rPr>
@@ -15592,98 +13969,20 @@
         <w:rPr>
           <w:lang w:eastAsia="en-AU"/>
         </w:rPr>
-        <w:t xml:space="preserve">The </w:t>
-      </w:r>
-      <w:proofErr w:type="spellStart"/>
-      <w:r>
-        <w:rPr>
-          <w:lang w:eastAsia="en-AU"/>
-        </w:rPr>
-        <w:t>VkImage</w:t>
-      </w:r>
-      <w:proofErr w:type="spellEnd"/>
-      <w:r>
-        <w:rPr>
-          <w:lang w:eastAsia="en-AU"/>
-        </w:rPr>
-        <w:t xml:space="preserve"> holds </w:t>
-      </w:r>
-      <w:r>
-        <w:rPr>
-          <w:lang w:eastAsia="en-AU"/>
-        </w:rPr>
-        <w:t xml:space="preserve">the mipmap data, but the </w:t>
-      </w:r>
-      <w:proofErr w:type="spellStart"/>
-      <w:r>
-        <w:rPr>
-          <w:lang w:eastAsia="en-AU"/>
-        </w:rPr>
-        <w:t>VkSampler</w:t>
-      </w:r>
-      <w:proofErr w:type="spellEnd"/>
-      <w:r>
-        <w:rPr>
-          <w:lang w:eastAsia="en-AU"/>
-        </w:rPr>
-        <w:t xml:space="preserve"> controls how that data is read during rendering. </w:t>
-      </w:r>
-      <w:r>
-        <w:rPr>
-          <w:lang w:eastAsia="en-AU"/>
-        </w:rPr>
-        <w:t xml:space="preserve">Vulkan lets us specify </w:t>
-      </w:r>
-      <w:proofErr w:type="spellStart"/>
-      <w:r>
-        <w:rPr>
-          <w:lang w:eastAsia="en-AU"/>
-        </w:rPr>
-        <w:t>minLod</w:t>
-      </w:r>
-      <w:proofErr w:type="spellEnd"/>
-      <w:r>
-        <w:rPr>
-          <w:lang w:eastAsia="en-AU"/>
-        </w:rPr>
-        <w:t xml:space="preserve">, </w:t>
-      </w:r>
-      <w:proofErr w:type="spellStart"/>
-      <w:r>
-        <w:rPr>
-          <w:lang w:eastAsia="en-AU"/>
-        </w:rPr>
-        <w:t>maxLod</w:t>
-      </w:r>
-      <w:proofErr w:type="spellEnd"/>
-      <w:r>
-        <w:rPr>
-          <w:lang w:eastAsia="en-AU"/>
-        </w:rPr>
-        <w:t xml:space="preserve">, </w:t>
-      </w:r>
-      <w:proofErr w:type="spellStart"/>
-      <w:r>
-        <w:rPr>
-          <w:lang w:eastAsia="en-AU"/>
-        </w:rPr>
-        <w:t>minLodBias</w:t>
-      </w:r>
-      <w:proofErr w:type="spellEnd"/>
-      <w:r>
-        <w:rPr>
-          <w:lang w:eastAsia="en-AU"/>
-        </w:rPr>
-        <w:t xml:space="preserve"> and </w:t>
-      </w:r>
-      <w:proofErr w:type="spellStart"/>
-      <w:r>
-        <w:rPr>
-          <w:lang w:eastAsia="en-AU"/>
-        </w:rPr>
-        <w:t>mipmapMode</w:t>
-      </w:r>
-      <w:proofErr w:type="spellEnd"/>
+        <w:t xml:space="preserve">The VkImage holds </w:t>
+      </w:r>
+      <w:r>
+        <w:rPr>
+          <w:lang w:eastAsia="en-AU"/>
+        </w:rPr>
+        <w:t xml:space="preserve">the mipmap data, but the VkSampler controls how that data is read during rendering. </w:t>
+      </w:r>
+      <w:r>
+        <w:rPr>
+          <w:lang w:eastAsia="en-AU"/>
+        </w:rPr>
+        <w:t>Vulkan lets us specify minLod, maxLod, minLodBias and mipmapMode</w:t>
+      </w:r>
       <w:r>
         <w:rPr>
           <w:lang w:eastAsia="en-AU"/>
@@ -15694,62 +13993,20 @@
         <w:rPr>
           <w:lang w:eastAsia="en-AU"/>
         </w:rPr>
-        <w:t xml:space="preserve">The sampler selects the correct </w:t>
-      </w:r>
-      <w:proofErr w:type="spellStart"/>
-      <w:r>
-        <w:rPr>
-          <w:lang w:eastAsia="en-AU"/>
-        </w:rPr>
-        <w:t>mip</w:t>
-      </w:r>
-      <w:proofErr w:type="spellEnd"/>
-      <w:r>
-        <w:rPr>
-          <w:lang w:eastAsia="en-AU"/>
-        </w:rPr>
-        <w:t xml:space="preserve"> level based on these pre-set values.</w:t>
-      </w:r>
-    </w:p>
-    <w:p>
-      <w:pPr>
-        <w:rPr>
-          <w:lang w:eastAsia="en-AU"/>
-        </w:rPr>
-      </w:pPr>
-      <w:r>
-        <w:rPr>
-          <w:lang w:eastAsia="en-AU"/>
-        </w:rPr>
-        <w:t xml:space="preserve">If you want to visualize higher </w:t>
-      </w:r>
-      <w:proofErr w:type="spellStart"/>
-      <w:r>
-        <w:rPr>
-          <w:lang w:eastAsia="en-AU"/>
-        </w:rPr>
-        <w:t>mip</w:t>
-      </w:r>
-      <w:proofErr w:type="spellEnd"/>
-      <w:r>
-        <w:rPr>
-          <w:lang w:eastAsia="en-AU"/>
-        </w:rPr>
-        <w:t xml:space="preserve"> levels, you can increase ‘</w:t>
-      </w:r>
-      <w:proofErr w:type="spellStart"/>
-      <w:r>
-        <w:rPr>
-          <w:lang w:eastAsia="en-AU"/>
-        </w:rPr>
-        <w:t>minLod</w:t>
-      </w:r>
-      <w:proofErr w:type="spellEnd"/>
-      <w:r>
-        <w:rPr>
-          <w:lang w:eastAsia="en-AU"/>
-        </w:rPr>
-        <w:t>’</w:t>
+        <w:t>The sampler selects the correct mip level based on these pre-set values.</w:t>
+      </w:r>
+    </w:p>
+    <w:p>
+      <w:pPr>
+        <w:rPr>
+          <w:lang w:eastAsia="en-AU"/>
+        </w:rPr>
+      </w:pPr>
+      <w:r>
+        <w:rPr>
+          <w:lang w:eastAsia="en-AU"/>
+        </w:rPr>
+        <w:t>If you want to visualize higher mip levels, you can increase ‘minLod’</w:t>
       </w:r>
       <w:r>
         <w:rPr>
@@ -15974,21 +14231,7 @@
         <w:rPr>
           <w:lang w:eastAsia="en-AU"/>
         </w:rPr>
-        <w:t xml:space="preserve"> This render target does *not* need any </w:t>
-      </w:r>
-      <w:proofErr w:type="spellStart"/>
-      <w:r>
-        <w:rPr>
-          <w:lang w:eastAsia="en-AU"/>
-        </w:rPr>
-        <w:t>mip</w:t>
-      </w:r>
-      <w:proofErr w:type="spellEnd"/>
-      <w:r>
-        <w:rPr>
-          <w:lang w:eastAsia="en-AU"/>
-        </w:rPr>
-        <w:t xml:space="preserve"> levels.</w:t>
+        <w:t xml:space="preserve"> This render target does *not* need any mip levels.</w:t>
       </w:r>
     </w:p>
     <w:p>
@@ -16658,21 +14901,7 @@
         <w:rPr>
           <w:lang w:eastAsia="en-AU"/>
         </w:rPr>
-        <w:t>Updated using ‘</w:t>
-      </w:r>
-      <w:proofErr w:type="spellStart"/>
-      <w:r>
-        <w:rPr>
-          <w:lang w:eastAsia="en-AU"/>
-        </w:rPr>
-        <w:t>vkCmdPushConstants</w:t>
-      </w:r>
-      <w:proofErr w:type="spellEnd"/>
-      <w:r>
-        <w:rPr>
-          <w:lang w:eastAsia="en-AU"/>
-        </w:rPr>
-        <w:t>’, which copies data directly into the push-constant range</w:t>
+        <w:t>Updated using ‘vkCmdPushConstants’, which copies data directly into the push-constant range</w:t>
       </w:r>
     </w:p>
     <w:p>
@@ -17708,21 +15937,7 @@
         <w:rPr>
           <w:lang w:eastAsia="en-AU"/>
         </w:rPr>
-        <w:t>descriptor set layout binding with X ‘</w:t>
-      </w:r>
-      <w:proofErr w:type="spellStart"/>
-      <w:r>
-        <w:rPr>
-          <w:lang w:eastAsia="en-AU"/>
-        </w:rPr>
-        <w:t>descriptorCount</w:t>
-      </w:r>
-      <w:proofErr w:type="spellEnd"/>
-      <w:r>
-        <w:rPr>
-          <w:lang w:eastAsia="en-AU"/>
-        </w:rPr>
-        <w:t xml:space="preserve">’ </w:t>
+        <w:t xml:space="preserve">descriptor set layout binding with X ‘descriptorCount’ </w:t>
       </w:r>
       <w:r>
         <w:rPr>
@@ -17842,29 +16057,251 @@
         <w:rPr>
           <w:lang w:eastAsia="en-AU"/>
         </w:rPr>
-        <w:t xml:space="preserve"> via ‘</w:t>
-      </w:r>
-      <w:proofErr w:type="spellStart"/>
-      <w:r>
-        <w:rPr>
-          <w:lang w:eastAsia="en-AU"/>
-        </w:rPr>
-        <w:t>vkUpdateDescriptorSets</w:t>
-      </w:r>
-      <w:proofErr w:type="spellEnd"/>
-      <w:r>
-        <w:rPr>
-          <w:lang w:eastAsia="en-AU"/>
-        </w:rPr>
-        <w:t>’</w:t>
-      </w:r>
-    </w:p>
-    <w:p>
-      <w:pPr>
-        <w:rPr>
-          <w:lang w:eastAsia="en-AU"/>
-        </w:rPr>
-      </w:pPr>
+        <w:t xml:space="preserve"> via ‘vkUpdateDescriptorSets’</w:t>
+      </w:r>
+    </w:p>
+    <w:p>
+      <w:pPr>
+        <w:rPr>
+          <w:lang w:eastAsia="en-AU"/>
+        </w:rPr>
+      </w:pPr>
+    </w:p>
+    <w:p>
+      <w:pPr>
+        <w:rPr>
+          <w:lang w:eastAsia="en-AU"/>
+        </w:rPr>
+      </w:pPr>
+      <w:r>
+        <w:rPr>
+          <w:lang w:eastAsia="en-AU"/>
+        </w:rPr>
+        <w:br w:type="page"/>
+      </w:r>
+    </w:p>
+    <w:p>
+      <w:pPr>
+        <w:rPr>
+          <w:b/>
+          <w:bCs/>
+          <w:sz w:val="40"/>
+          <w:szCs w:val="40"/>
+          <w:lang w:eastAsia="en-AU"/>
+        </w:rPr>
+      </w:pPr>
+      <w:r>
+        <w:rPr>
+          <w:b/>
+          <w:bCs/>
+          <w:sz w:val="40"/>
+          <w:szCs w:val="40"/>
+          <w:lang w:eastAsia="en-AU"/>
+        </w:rPr>
+        <w:lastRenderedPageBreak/>
+        <w:t>Instanced Rendering</w:t>
+      </w:r>
+    </w:p>
+    <w:p>
+      <w:pPr>
+        <w:rPr>
+          <w:lang w:eastAsia="en-AU"/>
+        </w:rPr>
+      </w:pPr>
+      <w:r>
+        <w:rPr>
+          <w:lang w:eastAsia="en-AU"/>
+        </w:rPr>
+        <w:t xml:space="preserve">What is instanced rendering? It is </w:t>
+      </w:r>
+      <w:r>
+        <w:rPr>
+          <w:lang w:eastAsia="en-AU"/>
+        </w:rPr>
+        <w:t>a way of keeping only a single copy of the original vertex data, while still allowing ‘instances’ to be rendered using per-instance data.</w:t>
+      </w:r>
+    </w:p>
+    <w:p>
+      <w:pPr>
+        <w:rPr>
+          <w:lang w:eastAsia="en-AU"/>
+        </w:rPr>
+      </w:pPr>
+      <w:r>
+        <w:rPr>
+          <w:lang w:eastAsia="en-AU"/>
+        </w:rPr>
+        <w:t>Per-instance data is completely up to the developer, but usually it is a per-instance transform (mat4) that is indexed on the shader level. Think of it like you have an array (or something similar) that is bound to the shader, and then you index it like any normal array.</w:t>
+      </w:r>
+      <w:r>
+        <w:rPr>
+          <w:lang w:eastAsia="en-AU"/>
+        </w:rPr>
+        <w:t xml:space="preserve"> </w:t>
+      </w:r>
+      <w:r>
+        <w:rPr>
+          <w:lang w:eastAsia="en-AU"/>
+        </w:rPr>
+        <w:t xml:space="preserve">This means with a single draw call, we can draw any number of </w:t>
+      </w:r>
+      <w:r>
+        <w:rPr>
+          <w:lang w:eastAsia="en-AU"/>
+        </w:rPr>
+        <w:t>instances</w:t>
+      </w:r>
+      <w:r>
+        <w:rPr>
+          <w:lang w:eastAsia="en-AU"/>
+        </w:rPr>
+        <w:t>.</w:t>
+      </w:r>
+    </w:p>
+    <w:p>
+      <w:pPr>
+        <w:rPr>
+          <w:lang w:eastAsia="en-AU"/>
+        </w:rPr>
+      </w:pPr>
+      <w:r>
+        <w:rPr>
+          <w:lang w:eastAsia="en-AU"/>
+        </w:rPr>
+        <w:t xml:space="preserve">To </w:t>
+      </w:r>
+      <w:r>
+        <w:rPr>
+          <w:lang w:eastAsia="en-AU"/>
+        </w:rPr>
+        <w:t>draw</w:t>
+      </w:r>
+      <w:r>
+        <w:rPr>
+          <w:lang w:eastAsia="en-AU"/>
+        </w:rPr>
+        <w:t xml:space="preserve"> instances, just use ‘vkCmdDrawIndex’ with the correct number of instances. Then in the shader use ‘gl_InstanceIndex’ to index into some data array.</w:t>
+      </w:r>
+    </w:p>
+    <w:p>
+      <w:pPr>
+        <w:rPr>
+          <w:b/>
+          <w:bCs/>
+          <w:sz w:val="28"/>
+          <w:szCs w:val="28"/>
+          <w:lang w:eastAsia="en-AU"/>
+        </w:rPr>
+      </w:pPr>
+      <w:r>
+        <w:rPr>
+          <w:b/>
+          <w:bCs/>
+          <w:sz w:val="28"/>
+          <w:szCs w:val="28"/>
+          <w:lang w:eastAsia="en-AU"/>
+        </w:rPr>
+        <w:t>Pros</w:t>
+      </w:r>
+    </w:p>
+    <w:p>
+      <w:pPr>
+        <w:pStyle w:val="ListParagraph"/>
+        <w:numPr>
+          <w:ilvl w:val="0"/>
+          <w:numId w:val="2"/>
+        </w:numPr>
+        <w:rPr>
+          <w:lang w:eastAsia="en-AU"/>
+        </w:rPr>
+      </w:pPr>
+      <w:r>
+        <w:rPr>
+          <w:lang w:eastAsia="en-AU"/>
+        </w:rPr>
+        <w:t>Very easy to use</w:t>
+      </w:r>
+      <w:r>
+        <w:rPr>
+          <w:lang w:eastAsia="en-AU"/>
+        </w:rPr>
+        <w:t xml:space="preserve"> (thank you Vulkan)</w:t>
+      </w:r>
+    </w:p>
+    <w:p>
+      <w:pPr>
+        <w:pStyle w:val="ListParagraph"/>
+        <w:numPr>
+          <w:ilvl w:val="0"/>
+          <w:numId w:val="2"/>
+        </w:numPr>
+        <w:rPr>
+          <w:lang w:eastAsia="en-AU"/>
+        </w:rPr>
+      </w:pPr>
+      <w:r>
+        <w:rPr>
+          <w:lang w:eastAsia="en-AU"/>
+        </w:rPr>
+        <w:t>Greatly reduces number of draw calls</w:t>
+      </w:r>
+    </w:p>
+    <w:p>
+      <w:pPr>
+        <w:rPr>
+          <w:b/>
+          <w:bCs/>
+          <w:sz w:val="28"/>
+          <w:szCs w:val="28"/>
+          <w:lang w:eastAsia="en-AU"/>
+        </w:rPr>
+      </w:pPr>
+      <w:r>
+        <w:rPr>
+          <w:b/>
+          <w:bCs/>
+          <w:sz w:val="28"/>
+          <w:szCs w:val="28"/>
+          <w:lang w:eastAsia="en-AU"/>
+        </w:rPr>
+        <w:t>Cons</w:t>
+      </w:r>
+    </w:p>
+    <w:p>
+      <w:pPr>
+        <w:pStyle w:val="ListParagraph"/>
+        <w:numPr>
+          <w:ilvl w:val="0"/>
+          <w:numId w:val="2"/>
+        </w:numPr>
+        <w:rPr>
+          <w:lang w:eastAsia="en-AU"/>
+        </w:rPr>
+      </w:pPr>
+      <w:r>
+        <w:rPr>
+          <w:lang w:eastAsia="en-AU"/>
+        </w:rPr>
+        <w:t>Runs</w:t>
+      </w:r>
+      <w:r>
+        <w:rPr>
+          <w:lang w:eastAsia="en-AU"/>
+        </w:rPr>
+        <w:t xml:space="preserve"> </w:t>
+      </w:r>
+      <w:r>
+        <w:rPr>
+          <w:lang w:eastAsia="en-AU"/>
+        </w:rPr>
+        <w:t xml:space="preserve">the </w:t>
+      </w:r>
+      <w:r>
+        <w:rPr>
+          <w:lang w:eastAsia="en-AU"/>
+        </w:rPr>
+        <w:t>same shader for every instance</w:t>
+      </w:r>
     </w:p>
     <w:p>
       <w:pPr>
@@ -19089,6 +17526,7 @@
   <w:style w:type="character" w:default="1" w:styleId="DefaultParagraphFont">
     <w:name w:val="Default Paragraph Font"/>
     <w:uiPriority w:val="1"/>
+    <w:semiHidden/>
     <w:unhideWhenUsed/>
   </w:style>
   <w:style w:type="table" w:default="1" w:styleId="TableNormal">

</xml_diff>